<commit_message>
feat(frontend): simulador de pagos con Luhn y accesibilidad; docs: 8 tablas, simulador de pagos, accesibilidad por teclado
Co-Authored-By: Claude Opus 5.5 <noreply@anthropic.com>
</commit_message>
<xml_diff>
--- a/docs/documento-tecnico.docx
+++ b/docs/documento-tecnico.docx
@@ -487,7 +487,7 @@
           <w:sz w:val="22"/>
           <w:szCs w:val="22"/>
         </w:rPr>
-        <w:t xml:space="preserve">Capa de datos: PostgreSQL 16 provisionada como servicio gratuito de Render, con siete tablas relacionales que modelan el dominio interno (proveedores, agencias, vehiculos, imagenes, holds, previews y ordenes).</w:t>
+        <w:t xml:space="preserve">Capa de datos: PostgreSQL 16 provisionada como servicio gratuito de Render, con ocho tablas relacionales que modelan el dominio interno (proveedores, agencias, vehiculos, imagenes, holds, previews, ordenes y suscripciones de webhooks).</w:t>
       </w:r>
     </w:p>
     <w:p>
@@ -2546,7 +2546,7 @@
           <w:sz w:val="22"/>
           <w:szCs w:val="22"/>
         </w:rPr>
-        <w:t xml:space="preserve">El modelo relacional interno se compone de siete tablas dentro de una sola base de datos PostgreSQL. Se mantienen los nombres de columna en ingles porque el contrato oficial (autos-openapi.yaml) tambien esta escrito en ingles, lo que reduce las conversiones entre capa de dominio y capa de exposicion.</w:t>
+        <w:t xml:space="preserve">El modelo relacional interno se compone de ocho tablas dentro de una sola base de datos PostgreSQL, y cada una de ellas cuenta con su propia API CRUD administrativa bajo /api/v1/admin/*. Se mantienen los nombres de columna en ingles porque el contrato oficial (autos-openapi.yaml) tambien esta escrito en ingles, lo que reduce las conversiones entre capa de dominio y capa de exposicion.</w:t>
       </w:r>
     </w:p>
     <w:p>
@@ -3106,6 +3106,71 @@
           </w:p>
         </w:tc>
       </w:tr>
+      <w:tr>
+        <w:tc>
+          <w:tcPr>
+            <w:tcW w:type="dxa" w:w="2500"/>
+          </w:tcPr>
+          <w:p>
+            <w:pPr>
+              <w:spacing w:after="40"/>
+              <w:jc w:val="left"/>
+            </w:pPr>
+            <w:r>
+              <w:rPr>
+                <w:rFonts w:ascii="Arial" w:cs="Arial" w:eastAsia="Arial" w:hAnsi="Arial"/>
+                <w:b w:val="false"/>
+                <w:bCs w:val="false"/>
+                <w:sz w:val="22"/>
+                <w:szCs w:val="22"/>
+              </w:rPr>
+              <w:t xml:space="preserve">webhook_subscriptions</w:t>
+            </w:r>
+          </w:p>
+        </w:tc>
+        <w:tc>
+          <w:tcPr>
+            <w:tcW w:type="dxa" w:w="3400"/>
+          </w:tcPr>
+          <w:p>
+            <w:pPr>
+              <w:spacing w:after="40"/>
+              <w:jc w:val="left"/>
+            </w:pPr>
+            <w:r>
+              <w:rPr>
+                <w:rFonts w:ascii="Arial" w:cs="Arial" w:eastAsia="Arial" w:hAnsi="Arial"/>
+                <w:b w:val="false"/>
+                <w:bCs w:val="false"/>
+                <w:sz w:val="22"/>
+                <w:szCs w:val="22"/>
+              </w:rPr>
+              <w:t xml:space="preserve">Suscripciones a eventos (webhooks)</w:t>
+            </w:r>
+          </w:p>
+        </w:tc>
+        <w:tc>
+          <w:tcPr>
+            <w:tcW w:type="dxa" w:w="3400"/>
+          </w:tcPr>
+          <w:p>
+            <w:pPr>
+              <w:spacing w:after="40"/>
+              <w:jc w:val="left"/>
+            </w:pPr>
+            <w:r>
+              <w:rPr>
+                <w:rFonts w:ascii="Arial" w:cs="Arial" w:eastAsia="Arial" w:hAnsi="Arial"/>
+                <w:b w:val="false"/>
+                <w:bCs w:val="false"/>
+                <w:sz w:val="22"/>
+                <w:szCs w:val="22"/>
+              </w:rPr>
+              <w:t xml:space="preserve">id (uuid), url, events, secret, active</w:t>
+            </w:r>
+          </w:p>
+        </w:tc>
+      </w:tr>
     </w:tbl>
     <w:p>
       <w:pPr>
@@ -3221,6 +3286,427 @@
     </w:p>
     <w:p>
       <w:pPr>
+        <w:pStyle w:val="Heading2"/>
+        <w:spacing w:after="160" w:before="280"/>
+        <w:jc w:val="left"/>
+      </w:pPr>
+      <w:r>
+        <w:rPr>
+          <w:rFonts w:ascii="Arial" w:cs="Arial" w:eastAsia="Arial" w:hAnsi="Arial"/>
+          <w:b/>
+          <w:bCs/>
+          <w:sz w:val="28"/>
+          <w:szCs w:val="28"/>
+        </w:rPr>
+        <w:t xml:space="preserve">5.3. APIs administrativas por tabla</w:t>
+      </w:r>
+    </w:p>
+    <w:p>
+      <w:pPr>
+        <w:spacing w:after="160" w:line="300"/>
+        <w:jc w:val="both"/>
+      </w:pPr>
+      <w:r>
+        <w:rPr>
+          <w:rFonts w:ascii="Arial" w:cs="Arial" w:eastAsia="Arial" w:hAnsi="Arial"/>
+          <w:sz w:val="22"/>
+          <w:szCs w:val="22"/>
+        </w:rPr>
+        <w:t xml:space="preserve">Ademas de los 15 endpoints del contrato, el backend expone una API CRUD por cada una de las ocho tablas, protegida con JWT y el scope autos:webhooks. Cada API ofrece </w:t>
+      </w:r>
+      <w:r>
+        <w:rPr>
+          <w:rFonts w:ascii="Courier New" w:cs="Courier New" w:eastAsia="Courier New" w:hAnsi="Courier New"/>
+          <w:sz w:val="22"/>
+          <w:szCs w:val="22"/>
+        </w:rPr>
+        <w:t xml:space="preserve">GET /</w:t>
+      </w:r>
+      <w:r>
+        <w:rPr>
+          <w:rFonts w:ascii="Arial" w:cs="Arial" w:eastAsia="Arial" w:hAnsi="Arial"/>
+          <w:sz w:val="22"/>
+          <w:szCs w:val="22"/>
+        </w:rPr>
+        <w:t xml:space="preserve"> (listar, con filtros por query string), </w:t>
+      </w:r>
+      <w:r>
+        <w:rPr>
+          <w:rFonts w:ascii="Courier New" w:cs="Courier New" w:eastAsia="Courier New" w:hAnsi="Courier New"/>
+          <w:sz w:val="22"/>
+          <w:szCs w:val="22"/>
+        </w:rPr>
+        <w:t xml:space="preserve">GET /:id</w:t>
+      </w:r>
+      <w:r>
+        <w:rPr>
+          <w:rFonts w:ascii="Arial" w:cs="Arial" w:eastAsia="Arial" w:hAnsi="Arial"/>
+          <w:sz w:val="22"/>
+          <w:szCs w:val="22"/>
+        </w:rPr>
+        <w:t xml:space="preserve">, </w:t>
+      </w:r>
+      <w:r>
+        <w:rPr>
+          <w:rFonts w:ascii="Courier New" w:cs="Courier New" w:eastAsia="Courier New" w:hAnsi="Courier New"/>
+          <w:sz w:val="22"/>
+          <w:szCs w:val="22"/>
+        </w:rPr>
+        <w:t xml:space="preserve">POST /</w:t>
+      </w:r>
+      <w:r>
+        <w:rPr>
+          <w:rFonts w:ascii="Arial" w:cs="Arial" w:eastAsia="Arial" w:hAnsi="Arial"/>
+          <w:sz w:val="22"/>
+          <w:szCs w:val="22"/>
+        </w:rPr>
+        <w:t xml:space="preserve">, </w:t>
+      </w:r>
+      <w:r>
+        <w:rPr>
+          <w:rFonts w:ascii="Courier New" w:cs="Courier New" w:eastAsia="Courier New" w:hAnsi="Courier New"/>
+          <w:sz w:val="22"/>
+          <w:szCs w:val="22"/>
+        </w:rPr>
+        <w:t xml:space="preserve">PUT /:id</w:t>
+      </w:r>
+      <w:r>
+        <w:rPr>
+          <w:rFonts w:ascii="Arial" w:cs="Arial" w:eastAsia="Arial" w:hAnsi="Arial"/>
+          <w:sz w:val="22"/>
+          <w:szCs w:val="22"/>
+        </w:rPr>
+        <w:t xml:space="preserve"> y </w:t>
+      </w:r>
+      <w:r>
+        <w:rPr>
+          <w:rFonts w:ascii="Courier New" w:cs="Courier New" w:eastAsia="Courier New" w:hAnsi="Courier New"/>
+          <w:sz w:val="22"/>
+          <w:szCs w:val="22"/>
+        </w:rPr>
+        <w:t xml:space="preserve">DELETE /:id</w:t>
+      </w:r>
+      <w:r>
+        <w:rPr>
+          <w:rFonts w:ascii="Arial" w:cs="Arial" w:eastAsia="Arial" w:hAnsi="Arial"/>
+          <w:sz w:val="22"/>
+          <w:szCs w:val="22"/>
+        </w:rPr>
+        <w:t xml:space="preserve">, y responde errores en formato Problem Details: 404 si el registro no existe, 400 si faltan campos obligatorios y 409 al eliminar un registro con dependencias.</w:t>
+      </w:r>
+    </w:p>
+    <w:p>
+      <w:pPr>
+        <w:pStyle w:val="ListParagraph"/>
+        <w:numPr>
+          <w:ilvl w:val="0"/>
+          <w:numId w:val="2"/>
+        </w:numPr>
+        <w:spacing w:after="80" w:line="280"/>
+        <w:jc w:val="both"/>
+      </w:pPr>
+      <w:r>
+        <w:rPr>
+          <w:rFonts w:ascii="Arial" w:cs="Arial" w:eastAsia="Arial" w:hAnsi="Arial"/>
+          <w:sz w:val="22"/>
+          <w:szCs w:val="22"/>
+        </w:rPr>
+        <w:t xml:space="preserve">suppliers: </w:t>
+      </w:r>
+      <w:r>
+        <w:rPr>
+          <w:rFonts w:ascii="Courier New" w:cs="Courier New" w:eastAsia="Courier New" w:hAnsi="Courier New"/>
+          <w:sz w:val="22"/>
+          <w:szCs w:val="22"/>
+        </w:rPr>
+        <w:t xml:space="preserve">/api/v1/admin/suppliers</w:t>
+      </w:r>
+      <w:r>
+        <w:rPr>
+          <w:rFonts w:ascii="Arial" w:cs="Arial" w:eastAsia="Arial" w:hAnsi="Arial"/>
+          <w:sz w:val="22"/>
+          <w:szCs w:val="22"/>
+        </w:rPr>
+        <w:t xml:space="preserve">.</w:t>
+      </w:r>
+    </w:p>
+    <w:p>
+      <w:pPr>
+        <w:pStyle w:val="ListParagraph"/>
+        <w:numPr>
+          <w:ilvl w:val="0"/>
+          <w:numId w:val="2"/>
+        </w:numPr>
+        <w:spacing w:after="80" w:line="280"/>
+        <w:jc w:val="both"/>
+      </w:pPr>
+      <w:r>
+        <w:rPr>
+          <w:rFonts w:ascii="Arial" w:cs="Arial" w:eastAsia="Arial" w:hAnsi="Arial"/>
+          <w:sz w:val="22"/>
+          <w:szCs w:val="22"/>
+        </w:rPr>
+        <w:t xml:space="preserve">depots: </w:t>
+      </w:r>
+      <w:r>
+        <w:rPr>
+          <w:rFonts w:ascii="Courier New" w:cs="Courier New" w:eastAsia="Courier New" w:hAnsi="Courier New"/>
+          <w:sz w:val="22"/>
+          <w:szCs w:val="22"/>
+        </w:rPr>
+        <w:t xml:space="preserve">/api/v1/admin/depots</w:t>
+      </w:r>
+      <w:r>
+        <w:rPr>
+          <w:rFonts w:ascii="Arial" w:cs="Arial" w:eastAsia="Arial" w:hAnsi="Arial"/>
+          <w:sz w:val="22"/>
+          <w:szCs w:val="22"/>
+        </w:rPr>
+        <w:t xml:space="preserve"> (emite el evento DEPOT_UPDATE en cada cambio).</w:t>
+      </w:r>
+    </w:p>
+    <w:p>
+      <w:pPr>
+        <w:pStyle w:val="ListParagraph"/>
+        <w:numPr>
+          <w:ilvl w:val="0"/>
+          <w:numId w:val="2"/>
+        </w:numPr>
+        <w:spacing w:after="80" w:line="280"/>
+        <w:jc w:val="both"/>
+      </w:pPr>
+      <w:r>
+        <w:rPr>
+          <w:rFonts w:ascii="Arial" w:cs="Arial" w:eastAsia="Arial" w:hAnsi="Arial"/>
+          <w:sz w:val="22"/>
+          <w:szCs w:val="22"/>
+        </w:rPr>
+        <w:t xml:space="preserve">vehicles: </w:t>
+      </w:r>
+      <w:r>
+        <w:rPr>
+          <w:rFonts w:ascii="Courier New" w:cs="Courier New" w:eastAsia="Courier New" w:hAnsi="Courier New"/>
+          <w:sz w:val="22"/>
+          <w:szCs w:val="22"/>
+        </w:rPr>
+        <w:t xml:space="preserve">/api/v1/admin/vehicles</w:t>
+      </w:r>
+      <w:r>
+        <w:rPr>
+          <w:rFonts w:ascii="Arial" w:cs="Arial" w:eastAsia="Arial" w:hAnsi="Arial"/>
+          <w:sz w:val="22"/>
+          <w:szCs w:val="22"/>
+        </w:rPr>
+        <w:t xml:space="preserve">.</w:t>
+      </w:r>
+    </w:p>
+    <w:p>
+      <w:pPr>
+        <w:pStyle w:val="ListParagraph"/>
+        <w:numPr>
+          <w:ilvl w:val="0"/>
+          <w:numId w:val="2"/>
+        </w:numPr>
+        <w:spacing w:after="80" w:line="280"/>
+        <w:jc w:val="both"/>
+      </w:pPr>
+      <w:r>
+        <w:rPr>
+          <w:rFonts w:ascii="Arial" w:cs="Arial" w:eastAsia="Arial" w:hAnsi="Arial"/>
+          <w:sz w:val="22"/>
+          <w:szCs w:val="22"/>
+        </w:rPr>
+        <w:t xml:space="preserve">vehicle_images: </w:t>
+      </w:r>
+      <w:r>
+        <w:rPr>
+          <w:rFonts w:ascii="Courier New" w:cs="Courier New" w:eastAsia="Courier New" w:hAnsi="Courier New"/>
+          <w:sz w:val="22"/>
+          <w:szCs w:val="22"/>
+        </w:rPr>
+        <w:t xml:space="preserve">/api/v1/admin/vehicle-images</w:t>
+      </w:r>
+      <w:r>
+        <w:rPr>
+          <w:rFonts w:ascii="Arial" w:cs="Arial" w:eastAsia="Arial" w:hAnsi="Arial"/>
+          <w:sz w:val="22"/>
+          <w:szCs w:val="22"/>
+        </w:rPr>
+        <w:t xml:space="preserve">.</w:t>
+      </w:r>
+    </w:p>
+    <w:p>
+      <w:pPr>
+        <w:pStyle w:val="ListParagraph"/>
+        <w:numPr>
+          <w:ilvl w:val="0"/>
+          <w:numId w:val="2"/>
+        </w:numPr>
+        <w:spacing w:after="80" w:line="280"/>
+        <w:jc w:val="both"/>
+      </w:pPr>
+      <w:r>
+        <w:rPr>
+          <w:rFonts w:ascii="Arial" w:cs="Arial" w:eastAsia="Arial" w:hAnsi="Arial"/>
+          <w:sz w:val="22"/>
+          <w:szCs w:val="22"/>
+        </w:rPr>
+        <w:t xml:space="preserve">holds: </w:t>
+      </w:r>
+      <w:r>
+        <w:rPr>
+          <w:rFonts w:ascii="Courier New" w:cs="Courier New" w:eastAsia="Courier New" w:hAnsi="Courier New"/>
+          <w:sz w:val="22"/>
+          <w:szCs w:val="22"/>
+        </w:rPr>
+        <w:t xml:space="preserve">/api/v1/admin/holds</w:t>
+      </w:r>
+      <w:r>
+        <w:rPr>
+          <w:rFonts w:ascii="Arial" w:cs="Arial" w:eastAsia="Arial" w:hAnsi="Arial"/>
+          <w:sz w:val="22"/>
+          <w:szCs w:val="22"/>
+        </w:rPr>
+        <w:t xml:space="preserve">.</w:t>
+      </w:r>
+    </w:p>
+    <w:p>
+      <w:pPr>
+        <w:pStyle w:val="ListParagraph"/>
+        <w:numPr>
+          <w:ilvl w:val="0"/>
+          <w:numId w:val="2"/>
+        </w:numPr>
+        <w:spacing w:after="80" w:line="280"/>
+        <w:jc w:val="both"/>
+      </w:pPr>
+      <w:r>
+        <w:rPr>
+          <w:rFonts w:ascii="Arial" w:cs="Arial" w:eastAsia="Arial" w:hAnsi="Arial"/>
+          <w:sz w:val="22"/>
+          <w:szCs w:val="22"/>
+        </w:rPr>
+        <w:t xml:space="preserve">order_previews: </w:t>
+      </w:r>
+      <w:r>
+        <w:rPr>
+          <w:rFonts w:ascii="Courier New" w:cs="Courier New" w:eastAsia="Courier New" w:hAnsi="Courier New"/>
+          <w:sz w:val="22"/>
+          <w:szCs w:val="22"/>
+        </w:rPr>
+        <w:t xml:space="preserve">/api/v1/admin/order-previews</w:t>
+      </w:r>
+      <w:r>
+        <w:rPr>
+          <w:rFonts w:ascii="Arial" w:cs="Arial" w:eastAsia="Arial" w:hAnsi="Arial"/>
+          <w:sz w:val="22"/>
+          <w:szCs w:val="22"/>
+        </w:rPr>
+        <w:t xml:space="preserve">.</w:t>
+      </w:r>
+    </w:p>
+    <w:p>
+      <w:pPr>
+        <w:pStyle w:val="ListParagraph"/>
+        <w:numPr>
+          <w:ilvl w:val="0"/>
+          <w:numId w:val="2"/>
+        </w:numPr>
+        <w:spacing w:after="80" w:line="280"/>
+        <w:jc w:val="both"/>
+      </w:pPr>
+      <w:r>
+        <w:rPr>
+          <w:rFonts w:ascii="Arial" w:cs="Arial" w:eastAsia="Arial" w:hAnsi="Arial"/>
+          <w:sz w:val="22"/>
+          <w:szCs w:val="22"/>
+        </w:rPr>
+        <w:t xml:space="preserve">orders: </w:t>
+      </w:r>
+      <w:r>
+        <w:rPr>
+          <w:rFonts w:ascii="Courier New" w:cs="Courier New" w:eastAsia="Courier New" w:hAnsi="Courier New"/>
+          <w:sz w:val="22"/>
+          <w:szCs w:val="22"/>
+        </w:rPr>
+        <w:t xml:space="preserve">/api/v1/admin/orders</w:t>
+      </w:r>
+      <w:r>
+        <w:rPr>
+          <w:rFonts w:ascii="Arial" w:cs="Arial" w:eastAsia="Arial" w:hAnsi="Arial"/>
+          <w:sz w:val="22"/>
+          <w:szCs w:val="22"/>
+        </w:rPr>
+        <w:t xml:space="preserve">.</w:t>
+      </w:r>
+    </w:p>
+    <w:p>
+      <w:pPr>
+        <w:pStyle w:val="ListParagraph"/>
+        <w:numPr>
+          <w:ilvl w:val="0"/>
+          <w:numId w:val="2"/>
+        </w:numPr>
+        <w:spacing w:after="80" w:line="280"/>
+        <w:jc w:val="both"/>
+      </w:pPr>
+      <w:r>
+        <w:rPr>
+          <w:rFonts w:ascii="Arial" w:cs="Arial" w:eastAsia="Arial" w:hAnsi="Arial"/>
+          <w:sz w:val="22"/>
+          <w:szCs w:val="22"/>
+        </w:rPr>
+        <w:t xml:space="preserve">webhook_subscriptions: </w:t>
+      </w:r>
+      <w:r>
+        <w:rPr>
+          <w:rFonts w:ascii="Courier New" w:cs="Courier New" w:eastAsia="Courier New" w:hAnsi="Courier New"/>
+          <w:sz w:val="22"/>
+          <w:szCs w:val="22"/>
+        </w:rPr>
+        <w:t xml:space="preserve">/api/v1/admin/webhooks</w:t>
+      </w:r>
+      <w:r>
+        <w:rPr>
+          <w:rFonts w:ascii="Arial" w:cs="Arial" w:eastAsia="Arial" w:hAnsi="Arial"/>
+          <w:sz w:val="22"/>
+          <w:szCs w:val="22"/>
+        </w:rPr>
+        <w:t xml:space="preserve">.</w:t>
+      </w:r>
+    </w:p>
+    <w:p>
+      <w:pPr>
+        <w:spacing w:after="160" w:line="300"/>
+        <w:jc w:val="both"/>
+      </w:pPr>
+      <w:r>
+        <w:rPr>
+          <w:rFonts w:ascii="Arial" w:cs="Arial" w:eastAsia="Arial" w:hAnsi="Arial"/>
+          <w:sz w:val="22"/>
+          <w:szCs w:val="22"/>
+        </w:rPr>
+        <w:t xml:space="preserve">El endpoint </w:t>
+      </w:r>
+      <w:r>
+        <w:rPr>
+          <w:rFonts w:ascii="Courier New" w:cs="Courier New" w:eastAsia="Courier New" w:hAnsi="Courier New"/>
+          <w:sz w:val="22"/>
+          <w:szCs w:val="22"/>
+        </w:rPr>
+        <w:t xml:space="preserve">GET /api/v1/admin/stats</w:t>
+      </w:r>
+      <w:r>
+        <w:rPr>
+          <w:rFonts w:ascii="Arial" w:cs="Arial" w:eastAsia="Arial" w:hAnsi="Arial"/>
+          <w:sz w:val="22"/>
+          <w:szCs w:val="22"/>
+        </w:rPr>
+        <w:t xml:space="preserve"> devuelve los conteos de las ocho tablas y los ingresos confirmados para el dashboard.</w:t>
+      </w:r>
+    </w:p>
+    <w:p>
+      <w:pPr>
         <w:pStyle w:val="Heading1"/>
         <w:spacing w:after="200" w:before="360"/>
         <w:jc w:val="left"/>
@@ -3508,6 +3994,322 @@
           <w:szCs w:val="22"/>
         </w:rPr>
         <w:t xml:space="preserve">La aplicacion se disena mobile-first utilizando CSS Grid y Flexbox con puntos de quiebre en 640 y 900 pixeles. La barra de navegacion colapsa en un menu hamburguesa en pantallas pequenas, el detalle del vehiculo pasa de dos columnas a una en anchos menores a 820 pixeles, y todas las imagenes utilizan atributos loading="lazy" y object-fit para preservar proporciones sin deformarse.</w:t>
+      </w:r>
+    </w:p>
+    <w:p>
+      <w:pPr>
+        <w:pStyle w:val="Heading2"/>
+        <w:spacing w:after="160" w:before="280"/>
+        <w:jc w:val="left"/>
+      </w:pPr>
+      <w:r>
+        <w:rPr>
+          <w:rFonts w:ascii="Arial" w:cs="Arial" w:eastAsia="Arial" w:hAnsi="Arial"/>
+          <w:b/>
+          <w:bCs/>
+          <w:sz w:val="28"/>
+          <w:szCs w:val="28"/>
+        </w:rPr>
+        <w:t xml:space="preserve">6.4. Simulador de pagos</w:t>
+      </w:r>
+    </w:p>
+    <w:p>
+      <w:pPr>
+        <w:spacing w:after="160" w:line="300"/>
+        <w:jc w:val="both"/>
+      </w:pPr>
+      <w:r>
+        <w:rPr>
+          <w:rFonts w:ascii="Arial" w:cs="Arial" w:eastAsia="Arial" w:hAnsi="Arial"/>
+          <w:sz w:val="22"/>
+          <w:szCs w:val="22"/>
+        </w:rPr>
+        <w:t xml:space="preserve">El contrato oficial declara en su descripcion que la logica de pagos pertenece a otros dominios/APIs: /orders/create solo recibe un payment_reference ya autorizado. Por ello el frontend implementa un simulador de pagos que se abre como ventana modal entre la previsualizacion y la creacion de la orden, y genera un payment_reference valido con el formato </w:t>
+      </w:r>
+      <w:r>
+        <w:rPr>
+          <w:rFonts w:ascii="Courier New" w:cs="Courier New" w:eastAsia="Courier New" w:hAnsi="Courier New"/>
+          <w:sz w:val="22"/>
+          <w:szCs w:val="22"/>
+        </w:rPr>
+        <w:t xml:space="preserve">PAY-SIM-</w:t>
+      </w:r>
+      <w:r>
+        <w:rPr>
+          <w:rFonts w:ascii="Arial" w:cs="Arial" w:eastAsia="Arial" w:hAnsi="Arial"/>
+          <w:sz w:val="22"/>
+          <w:szCs w:val="22"/>
+        </w:rPr>
+        <w:t xml:space="preserve"> seguido de 10 caracteres hexadecimales aleatorios antes de invocar /orders/create.</w:t>
+      </w:r>
+    </w:p>
+    <w:p>
+      <w:pPr>
+        <w:pStyle w:val="ListParagraph"/>
+        <w:numPr>
+          <w:ilvl w:val="0"/>
+          <w:numId w:val="2"/>
+        </w:numPr>
+        <w:spacing w:after="80" w:line="280"/>
+        <w:jc w:val="both"/>
+      </w:pPr>
+      <w:r>
+        <w:rPr>
+          <w:rFonts w:ascii="Arial" w:cs="Arial" w:eastAsia="Arial" w:hAnsi="Arial"/>
+          <w:sz w:val="22"/>
+          <w:szCs w:val="22"/>
+        </w:rPr>
+        <w:t xml:space="preserve">Campos: numero de tarjeta de 16 digitos con mascara 4-4-4-4 y validacion con el algoritmo de Luhn, nombre del titular (minimo 3 caracteres), fecha de expiracion MM/AA que rechaza fechas vencidas y CVV de 3 digitos.</w:t>
+      </w:r>
+    </w:p>
+    <w:p>
+      <w:pPr>
+        <w:pStyle w:val="ListParagraph"/>
+        <w:numPr>
+          <w:ilvl w:val="0"/>
+          <w:numId w:val="2"/>
+        </w:numPr>
+        <w:spacing w:after="80" w:line="280"/>
+        <w:jc w:val="both"/>
+      </w:pPr>
+      <w:r>
+        <w:rPr>
+          <w:rFonts w:ascii="Arial" w:cs="Arial" w:eastAsia="Arial" w:hAnsi="Arial"/>
+          <w:sz w:val="22"/>
+          <w:szCs w:val="22"/>
+        </w:rPr>
+        <w:t xml:space="preserve">Muestra el total a cobrar tomado de preview.data.total_price y un aviso visible de modo simulador: ningun cargo real se procesa y los datos de la tarjeta nunca se envian al backend.</w:t>
+      </w:r>
+    </w:p>
+    <w:p>
+      <w:pPr>
+        <w:pStyle w:val="ListParagraph"/>
+        <w:numPr>
+          <w:ilvl w:val="0"/>
+          <w:numId w:val="2"/>
+        </w:numPr>
+        <w:spacing w:after="80" w:line="280"/>
+        <w:jc w:val="both"/>
+      </w:pPr>
+      <w:r>
+        <w:rPr>
+          <w:rFonts w:ascii="Arial" w:cs="Arial" w:eastAsia="Arial" w:hAnsi="Arial"/>
+          <w:sz w:val="22"/>
+          <w:szCs w:val="22"/>
+        </w:rPr>
+        <w:t xml:space="preserve">Tarjeta de prueba: </w:t>
+      </w:r>
+      <w:r>
+        <w:rPr>
+          <w:rFonts w:ascii="Courier New" w:cs="Courier New" w:eastAsia="Courier New" w:hAnsi="Courier New"/>
+          <w:sz w:val="22"/>
+          <w:szCs w:val="22"/>
+        </w:rPr>
+        <w:t xml:space="preserve">4111 1111 1111 1111</w:t>
+      </w:r>
+      <w:r>
+        <w:rPr>
+          <w:rFonts w:ascii="Arial" w:cs="Arial" w:eastAsia="Arial" w:hAnsi="Arial"/>
+          <w:sz w:val="22"/>
+          <w:szCs w:val="22"/>
+        </w:rPr>
+        <w:t xml:space="preserve">, expiracion </w:t>
+      </w:r>
+      <w:r>
+        <w:rPr>
+          <w:rFonts w:ascii="Courier New" w:cs="Courier New" w:eastAsia="Courier New" w:hAnsi="Courier New"/>
+          <w:sz w:val="22"/>
+          <w:szCs w:val="22"/>
+        </w:rPr>
+        <w:t xml:space="preserve">12/30</w:t>
+      </w:r>
+      <w:r>
+        <w:rPr>
+          <w:rFonts w:ascii="Arial" w:cs="Arial" w:eastAsia="Arial" w:hAnsi="Arial"/>
+          <w:sz w:val="22"/>
+          <w:szCs w:val="22"/>
+        </w:rPr>
+        <w:t xml:space="preserve">, CVV </w:t>
+      </w:r>
+      <w:r>
+        <w:rPr>
+          <w:rFonts w:ascii="Courier New" w:cs="Courier New" w:eastAsia="Courier New" w:hAnsi="Courier New"/>
+          <w:sz w:val="22"/>
+          <w:szCs w:val="22"/>
+        </w:rPr>
+        <w:t xml:space="preserve">123</w:t>
+      </w:r>
+      <w:r>
+        <w:rPr>
+          <w:rFonts w:ascii="Arial" w:cs="Arial" w:eastAsia="Arial" w:hAnsi="Arial"/>
+          <w:sz w:val="22"/>
+          <w:szCs w:val="22"/>
+        </w:rPr>
+        <w:t xml:space="preserve">. El boton "Usar tarjeta de prueba" autollena los cuatro campos.</w:t>
+      </w:r>
+    </w:p>
+    <w:p>
+      <w:pPr>
+        <w:pStyle w:val="ListParagraph"/>
+        <w:numPr>
+          <w:ilvl w:val="0"/>
+          <w:numId w:val="2"/>
+        </w:numPr>
+        <w:spacing w:after="80" w:line="280"/>
+        <w:jc w:val="both"/>
+      </w:pPr>
+      <w:r>
+        <w:rPr>
+          <w:rFonts w:ascii="Arial" w:cs="Arial" w:eastAsia="Arial" w:hAnsi="Arial"/>
+          <w:sz w:val="22"/>
+          <w:szCs w:val="22"/>
+        </w:rPr>
+        <w:t xml:space="preserve">Al pagar se muestra "Procesando pago..." durante 2 segundos; si /orders/create falla, el error se muestra dentro del modal y se permite reintentar.</w:t>
+      </w:r>
+    </w:p>
+    <w:p>
+      <w:pPr>
+        <w:pStyle w:val="Heading2"/>
+        <w:spacing w:after="160" w:before="280"/>
+        <w:jc w:val="left"/>
+      </w:pPr>
+      <w:r>
+        <w:rPr>
+          <w:rFonts w:ascii="Arial" w:cs="Arial" w:eastAsia="Arial" w:hAnsi="Arial"/>
+          <w:b/>
+          <w:bCs/>
+          <w:sz w:val="28"/>
+          <w:szCs w:val="28"/>
+        </w:rPr>
+        <w:t xml:space="preserve">6.5. Accesibilidad por teclado</w:t>
+      </w:r>
+    </w:p>
+    <w:p>
+      <w:pPr>
+        <w:spacing w:after="160" w:line="300"/>
+        <w:jc w:val="both"/>
+      </w:pPr>
+      <w:r>
+        <w:rPr>
+          <w:rFonts w:ascii="Arial" w:cs="Arial" w:eastAsia="Arial" w:hAnsi="Arial"/>
+          <w:sz w:val="22"/>
+          <w:szCs w:val="22"/>
+        </w:rPr>
+        <w:t xml:space="preserve">Todo el sitio puede recorrerse unicamente con el teclado (Tab, Shift+Tab, Enter, Espacio y Escape):</w:t>
+      </w:r>
+    </w:p>
+    <w:p>
+      <w:pPr>
+        <w:pStyle w:val="ListParagraph"/>
+        <w:numPr>
+          <w:ilvl w:val="0"/>
+          <w:numId w:val="2"/>
+        </w:numPr>
+        <w:spacing w:after="80" w:line="280"/>
+        <w:jc w:val="both"/>
+      </w:pPr>
+      <w:r>
+        <w:rPr>
+          <w:rFonts w:ascii="Arial" w:cs="Arial" w:eastAsia="Arial" w:hAnsi="Arial"/>
+          <w:sz w:val="22"/>
+          <w:szCs w:val="22"/>
+        </w:rPr>
+        <w:t xml:space="preserve">Enlace "Saltar al contenido" como primer elemento enfocable, que lleva el foco directamente al contenido principal.</w:t>
+      </w:r>
+    </w:p>
+    <w:p>
+      <w:pPr>
+        <w:pStyle w:val="ListParagraph"/>
+        <w:numPr>
+          <w:ilvl w:val="0"/>
+          <w:numId w:val="2"/>
+        </w:numPr>
+        <w:spacing w:after="80" w:line="280"/>
+        <w:jc w:val="both"/>
+      </w:pPr>
+      <w:r>
+        <w:rPr>
+          <w:rFonts w:ascii="Arial" w:cs="Arial" w:eastAsia="Arial" w:hAnsi="Arial"/>
+          <w:sz w:val="22"/>
+          <w:szCs w:val="22"/>
+        </w:rPr>
+        <w:t xml:space="preserve">Anillo de foco ambar visible en todos los elementos interactivos, incluido el navbar oscuro y el icono de calendario de los campos de fecha de Chrome.</w:t>
+      </w:r>
+    </w:p>
+    <w:p>
+      <w:pPr>
+        <w:pStyle w:val="ListParagraph"/>
+        <w:numPr>
+          <w:ilvl w:val="0"/>
+          <w:numId w:val="2"/>
+        </w:numPr>
+        <w:spacing w:after="80" w:line="280"/>
+        <w:jc w:val="both"/>
+      </w:pPr>
+      <w:r>
+        <w:rPr>
+          <w:rFonts w:ascii="Arial" w:cs="Arial" w:eastAsia="Arial" w:hAnsi="Arial"/>
+          <w:sz w:val="22"/>
+          <w:szCs w:val="22"/>
+        </w:rPr>
+        <w:t xml:space="preserve">Al cambiar de pagina el foco pasa al contenido principal, de modo que la navegacion continua desde la nueva vista.</w:t>
+      </w:r>
+    </w:p>
+    <w:p>
+      <w:pPr>
+        <w:pStyle w:val="ListParagraph"/>
+        <w:numPr>
+          <w:ilvl w:val="0"/>
+          <w:numId w:val="2"/>
+        </w:numPr>
+        <w:spacing w:after="80" w:line="280"/>
+        <w:jc w:val="both"/>
+      </w:pPr>
+      <w:r>
+        <w:rPr>
+          <w:rFonts w:ascii="Arial" w:cs="Arial" w:eastAsia="Arial" w:hAnsi="Arial"/>
+          <w:sz w:val="22"/>
+          <w:szCs w:val="22"/>
+        </w:rPr>
+        <w:t xml:space="preserve">Menu movil accesible: se abre con Enter llevando el foco al primer enlace, se cierra con Escape devolviendo el foco al boton, y expone aria-expanded.</w:t>
+      </w:r>
+    </w:p>
+    <w:p>
+      <w:pPr>
+        <w:pStyle w:val="ListParagraph"/>
+        <w:numPr>
+          <w:ilvl w:val="0"/>
+          <w:numId w:val="2"/>
+        </w:numPr>
+        <w:spacing w:after="80" w:line="280"/>
+        <w:jc w:val="both"/>
+      </w:pPr>
+      <w:r>
+        <w:rPr>
+          <w:rFonts w:ascii="Arial" w:cs="Arial" w:eastAsia="Arial" w:hAnsi="Arial"/>
+          <w:sz w:val="22"/>
+          <w:szCs w:val="22"/>
+        </w:rPr>
+        <w:t xml:space="preserve">Focus trap en modales: en el simulador de pagos el foco inicia en el primer campo, Tab y Shift+Tab no salen de la ventana y Escape la cierra.</w:t>
+      </w:r>
+    </w:p>
+    <w:p>
+      <w:pPr>
+        <w:pStyle w:val="ListParagraph"/>
+        <w:numPr>
+          <w:ilvl w:val="0"/>
+          <w:numId w:val="2"/>
+        </w:numPr>
+        <w:spacing w:after="80" w:line="280"/>
+        <w:jc w:val="both"/>
+      </w:pPr>
+      <w:r>
+        <w:rPr>
+          <w:rFonts w:ascii="Arial" w:cs="Arial" w:eastAsia="Arial" w:hAnsi="Arial"/>
+          <w:sz w:val="22"/>
+          <w:szCs w:val="22"/>
+        </w:rPr>
+        <w:t xml:space="preserve">Verificacion: 23/23 pruebas automatizadas con Playwright sobre Chrome real recorren el sitio solo con teclado.</w:t>
       </w:r>
     </w:p>
     <w:p>

</xml_diff>

<commit_message>
feat(i18n): ortografía española completa (ñ y tildes); fix(reservas): validaciones de fecha robustas en frontend y backend; feat(admin): CRUD completo de usuarios con generación de contraseñas; feat(seed): 12 reservas históricas para que el dashboard muestre ingresos reales
Co-Authored-By: Claude Opus 5.5 <noreply@anthropic.com>
</commit_message>
<xml_diff>
--- a/docs/documento-tecnico.docx
+++ b/docs/documento-tecnico.docx
@@ -15,7 +15,7 @@
           <w:sz w:val="28"/>
           <w:szCs w:val="28"/>
         </w:rPr>
-        <w:t xml:space="preserve">PONTIFICIA UNIVERSIDAD CATOLICA DEL ECUADOR</w:t>
+        <w:t xml:space="preserve">PONTIFICIA UNIVERSIDAD CATÓLICA DEL ECUADOR</w:t>
       </w:r>
     </w:p>
     <w:p>
@@ -31,7 +31,7 @@
           <w:sz w:val="24"/>
           <w:szCs w:val="24"/>
         </w:rPr>
-        <w:t xml:space="preserve">FACULTAD DE INGENIERIA</w:t>
+        <w:t xml:space="preserve">FACULTAD DE INGENIERÍA</w:t>
       </w:r>
     </w:p>
     <w:p>
@@ -47,7 +47,7 @@
           <w:sz w:val="24"/>
           <w:szCs w:val="24"/>
         </w:rPr>
-        <w:t xml:space="preserve">INGENIERIA EN SISTEMAS DE INFORMACION</w:t>
+        <w:t xml:space="preserve">INGENIERÍA EN SISTEMAS DE INFORMACIÓN</w:t>
       </w:r>
     </w:p>
     <w:p>
@@ -63,7 +63,7 @@
           <w:sz w:val="32"/>
           <w:szCs w:val="32"/>
         </w:rPr>
-        <w:t xml:space="preserve">DOCUMENTO TECNICO</w:t>
+        <w:t xml:space="preserve">DOCUMENTO TÉCNICO</w:t>
       </w:r>
     </w:p>
     <w:p>
@@ -93,7 +93,7 @@
           <w:sz w:val="24"/>
           <w:szCs w:val="24"/>
         </w:rPr>
-        <w:t xml:space="preserve">Implementacion del contrato GDS Autos Core API v1.0.0</w:t>
+        <w:t xml:space="preserve">Implementación del contrato GDS Autos Core API v1.0.0</w:t>
       </w:r>
     </w:p>
     <w:p>
@@ -123,7 +123,7 @@
           <w:sz w:val="22"/>
           <w:szCs w:val="22"/>
         </w:rPr>
-        <w:t xml:space="preserve">Asignatura: Integracion de Sistemas</w:t>
+        <w:t xml:space="preserve">Asignatura: Integración de Sistemas</w:t>
       </w:r>
     </w:p>
     <w:p>
@@ -220,7 +220,7 @@
           <w:sz w:val="22"/>
           <w:szCs w:val="22"/>
         </w:rPr>
-        <w:t xml:space="preserve">RentaFacil EC es la implementacion realizada por Anthony Rosero del contrato oficial GDS Autos Core API v1.0.0, provisto por la docente del curso en el repositorio semestre5grupal-ops/Plantilla-Integracion-Sistemas, archivo contracts/autos-openapi.yaml. Este documento describe la arquitectura, el modelo de datos, el cumplimiento del contrato, las decisiones de despliegue y la propuesta de evolucion hacia microservicios correspondientes al Reto 1 del proyecto integrador Booking Prototipo.</w:t>
+        <w:t xml:space="preserve">RentaFacil EC es la implementación realizada por Anthony Rosero del contrato oficial GDS Autos Core API v1.0.0, provisto por la docente del curso en el repositorio semestre5grupal-ops/Plantilla-Integración-Sistemas, archivo contracts/autos-openapi.yaml. Este documento describe la arquitectura, el modelo de datos, el cumplimiento del contrato, las decisiones de despliegue y la propuesta de evolución hacia microservicios correspondientes al Reto 1 del proyecto integrador Booking Prototipo.</w:t>
       </w:r>
     </w:p>
     <w:p>
@@ -234,7 +234,7 @@
           <w:sz w:val="22"/>
           <w:szCs w:val="22"/>
         </w:rPr>
-        <w:t xml:space="preserve">El sistema se compone de un backend expuesto como API REST construido con NestJS y TypeORM sobre PostgreSQL, un frontend responsivo desarrollado en React con Vite y TypeScript, y una documentacion viva de contratos publicada mediante Swagger. Todos los endpoints publicos del contrato quedan implementados al pie de la letra, incluyendo cabeceras X-Affiliate-Id e Idempotency-Key, autorizacion OAuth2 con scopes y respuestas de error en formato Problem Details (RFC 7807).</w:t>
+        <w:t xml:space="preserve">El sistema se compone de un backend expuesto como API REST construido con NestJS y TypeORM sobre PostgreSQL, un frontend responsivo desarrollado en React con Vite y TypeScript, y una documentación viva de contratos publicada mediante Swagger. Todos los endpoints públicos del contrato quedan implementados al pie de la letra, incluyendo cabeceras X-Affiliate-Id e Idempotency-Key, autorización OAuth2 con scopes y respuestas de error en formato Problem Details (RFC 7807).</w:t>
       </w:r>
     </w:p>
     <w:p>
@@ -251,7 +251,7 @@
           <w:sz w:val="32"/>
           <w:szCs w:val="32"/>
         </w:rPr>
-        <w:t xml:space="preserve">2. Introduccion</w:t>
+        <w:t xml:space="preserve">2. Introducción</w:t>
       </w:r>
     </w:p>
     <w:p>
@@ -265,7 +265,7 @@
           <w:sz w:val="22"/>
           <w:szCs w:val="22"/>
         </w:rPr>
-        <w:t xml:space="preserve">El proyecto integrador Booking Prototipo busca que los estudiantes construyan un ecosistema de sistemas de informacion independientes que, en fases posteriores, se integren a una plataforma central de tipo agregador. Cada estudiante desarrolla su propio dominio de ventas con un enfoque API-first, cubriendo administracion, marketplace publico y APIs preparadas para interoperar.</w:t>
+        <w:t xml:space="preserve">El proyecto integrador Booking Prototipo busca que los estudiantes construyan un ecosistema de sistemas de información independientes que, en fases posteriores, se integren a una plataforma central de tipo agregador. Cada estudiante desarrolla su propio dominio de ventas con un enfoque API-first, cubriendo administración, marketplace público y APIs preparadas para interoperar.</w:t>
       </w:r>
     </w:p>
     <w:p>
@@ -279,7 +279,7 @@
           <w:sz w:val="22"/>
           <w:szCs w:val="22"/>
         </w:rPr>
-        <w:t xml:space="preserve">RentaFacil EC corresponde al dominio Autos asumido por el autor. Su alcance funcional consiste en implementar el microservicio central de busqueda, disponibilidad, reservas y postventa de renta de vehiculos, siguiendo el contrato oficial GDS Autos Core API. El sistema simula el flujo completo de un cliente que busca un vehiculo por rango de fechas y agencia, revisa sus caracteristicas, bloquea temporalmente el precio, previsualiza el desglose y confirma la reserva.</w:t>
+        <w:t xml:space="preserve">RentaFacil EC corresponde al dominio Autos asumido por el autor. Su alcance funcional consiste en implementar el microservicio central de búsqueda, disponibilidad, reservas y postventa de renta de vehículos, siguiendo el contrato oficial GDS Autos Core API. El sistema simula el flujo completo de un cliente que busca un vehículo por rango de fechas y agencia, revisa sus características, bloquea temporalmente el precio, previsualiza el desglose y confirma la reserva.</w:t>
       </w:r>
     </w:p>
     <w:p>
@@ -315,7 +315,7 @@
           <w:sz w:val="22"/>
           <w:szCs w:val="22"/>
         </w:rPr>
-        <w:t xml:space="preserve">Implementar el contrato GDS Autos Core API v1.0.0 sin desviaciones en URLs, verbos, headers, esquemas o codigos de estado.</w:t>
+        <w:t xml:space="preserve">Implementar el contrato GDS Autos Core API v1.0.0 sin desviaciones en URLs, verbos, headers, esquemas o códigos de estado.</w:t>
       </w:r>
     </w:p>
     <w:p>
@@ -372,7 +372,7 @@
           <w:sz w:val="22"/>
           <w:szCs w:val="22"/>
         </w:rPr>
-        <w:t xml:space="preserve">Dejar sentadas las bases para la integracion con la plataforma central Booking Prototipo prevista en el Reto 2.</w:t>
+        <w:t xml:space="preserve">Dejar sentadas las bases para la integración con la plataforma central Booking Prototipo prevista en el Reto 2.</w:t>
       </w:r>
     </w:p>
     <w:p>
@@ -403,7 +403,7 @@
           <w:sz w:val="22"/>
           <w:szCs w:val="22"/>
         </w:rPr>
-        <w:t xml:space="preserve">De acuerdo con la guia oficial del proyecto, el Reto 1 acepta una arquitectura simplificada basada en una unica base de datos y un monolito modular expuesto por APIs REST. Se entregan: sistema desplegado en Internet, backend con APIs documentadas segun el contrato oficial, sistema de administracion funcional, marketplace web funcional, base de datos operativa y este documento tecnico.</w:t>
+        <w:t xml:space="preserve">De acuerdo con la guia oficial del proyecto, el Reto 1 acepta una arquitectura simplificada basada en una única base de datos y un monolito modular expuesto por APIs REST. Se entregan: sistema desplegado en Internet, backend con APIs documentadas según el contrato oficial, sistema de administración funcional, marketplace web funcional, base de datos operativa y este documento técnico.</w:t>
       </w:r>
     </w:p>
     <w:p>
@@ -451,7 +451,7 @@
           <w:sz w:val="22"/>
           <w:szCs w:val="22"/>
         </w:rPr>
-        <w:t xml:space="preserve">El sistema se compone de tres actores principales: el cliente final que consume el marketplace desde su navegador web o dispositivo movil, el administrador que gestiona el inventario desde el panel de administracion, y la futura plataforma central Booking Prototipo que consumira los endpoints del contrato oficial para integrar la informacion agregada de vehiculos disponibles.</w:t>
+        <w:t xml:space="preserve">El sistema se compone de tres actores principales: el cliente final que consume el marketplace desde su navegador web o dispositivo móvil, el administrador que gestiona el inventario desde el panel de administración, y la futura plataforma central Booking Prototipo que consumirá los endpoints del contrato oficial para integrar la información agregada de vehículos disponibles.</w:t>
       </w:r>
     </w:p>
     <w:p>
@@ -487,45 +487,45 @@
           <w:sz w:val="22"/>
           <w:szCs w:val="22"/>
         </w:rPr>
-        <w:t xml:space="preserve">Capa de datos: PostgreSQL 16 provisionada como servicio gratuito de Render, con ocho tablas relacionales que modelan el dominio interno (proveedores, agencias, vehiculos, imagenes, holds, previews, ordenes y suscripciones de webhooks).</w:t>
-      </w:r>
-    </w:p>
-    <w:p>
-      <w:pPr>
-        <w:pStyle w:val="ListParagraph"/>
-        <w:numPr>
-          <w:ilvl w:val="0"/>
-          <w:numId w:val="2"/>
-        </w:numPr>
-        <w:spacing w:after="80" w:line="280"/>
-        <w:jc w:val="both"/>
-      </w:pPr>
-      <w:r>
-        <w:rPr>
-          <w:rFonts w:ascii="Arial" w:cs="Arial" w:eastAsia="Arial" w:hAnsi="Arial"/>
-          <w:sz w:val="22"/>
-          <w:szCs w:val="22"/>
-        </w:rPr>
-        <w:t xml:space="preserve">Capa de logica y APIs: Backend NestJS 10 con TypeScript, TypeORM 0.3 para persistencia, class-validator para validacion declarativa de DTOs, @nestjs/jwt para firmar los tokens OAuth2 locales, y @nestjs/swagger para documentar y probar los endpoints en tiempo real.</w:t>
-      </w:r>
-    </w:p>
-    <w:p>
-      <w:pPr>
-        <w:pStyle w:val="ListParagraph"/>
-        <w:numPr>
-          <w:ilvl w:val="0"/>
-          <w:numId w:val="2"/>
-        </w:numPr>
-        <w:spacing w:after="80" w:line="280"/>
-        <w:jc w:val="both"/>
-      </w:pPr>
-      <w:r>
-        <w:rPr>
-          <w:rFonts w:ascii="Arial" w:cs="Arial" w:eastAsia="Arial" w:hAnsi="Arial"/>
-          <w:sz w:val="22"/>
-          <w:szCs w:val="22"/>
-        </w:rPr>
-        <w:t xml:space="preserve">Capa de presentacion: Frontend React 18 + Vite + TypeScript con React Router para navegacion y Axios como cliente HTTP. El cliente inyecta automaticamente las cabeceras X-Affiliate-Id y Authorization: Bearer en cada peticion.</w:t>
+        <w:t xml:space="preserve">Capa de datos: PostgreSQL 16 provisionada como servicio gratuito de Render, con nueve tablas relacionales que modelan el dominio interno (proveedores, agencias, vehículos, imágenes, holds, previews, órdenes, suscripciones de webhooks y usuarios).</w:t>
+      </w:r>
+    </w:p>
+    <w:p>
+      <w:pPr>
+        <w:pStyle w:val="ListParagraph"/>
+        <w:numPr>
+          <w:ilvl w:val="0"/>
+          <w:numId w:val="2"/>
+        </w:numPr>
+        <w:spacing w:after="80" w:line="280"/>
+        <w:jc w:val="both"/>
+      </w:pPr>
+      <w:r>
+        <w:rPr>
+          <w:rFonts w:ascii="Arial" w:cs="Arial" w:eastAsia="Arial" w:hAnsi="Arial"/>
+          <w:sz w:val="22"/>
+          <w:szCs w:val="22"/>
+        </w:rPr>
+        <w:t xml:space="preserve">Capa de lógica y APIs: Backend NestJS 10 con TypeScript, TypeORM 0.3 para persistencia, class-validator para validación declarativa de DTOs, @nestjs/jwt para firmar los tokens OAuth2 locales, y @nestjs/swagger para documentar y probar los endpoints en tiempo real.</w:t>
+      </w:r>
+    </w:p>
+    <w:p>
+      <w:pPr>
+        <w:pStyle w:val="ListParagraph"/>
+        <w:numPr>
+          <w:ilvl w:val="0"/>
+          <w:numId w:val="2"/>
+        </w:numPr>
+        <w:spacing w:after="80" w:line="280"/>
+        <w:jc w:val="both"/>
+      </w:pPr>
+      <w:r>
+        <w:rPr>
+          <w:rFonts w:ascii="Arial" w:cs="Arial" w:eastAsia="Arial" w:hAnsi="Arial"/>
+          <w:sz w:val="22"/>
+          <w:szCs w:val="22"/>
+        </w:rPr>
+        <w:t xml:space="preserve">Capa de presentación: Frontend React 18 + Vite + TypeScript con React Router para navegación y Axios como cliente HTTP. El cliente inyecta automáticamente las cabeceras X-Affiliate-Id y Authorization: Bearer en cada petición.</w:t>
       </w:r>
     </w:p>
     <w:p>
@@ -542,7 +542,7 @@
           <w:sz w:val="28"/>
           <w:szCs w:val="28"/>
         </w:rPr>
-        <w:t xml:space="preserve">3.3. Diagrama logico</w:t>
+        <w:t xml:space="preserve">3.3. Diagrama lógico</w:t>
       </w:r>
     </w:p>
     <w:p>
@@ -769,7 +769,7 @@
           <w:sz w:val="28"/>
           <w:szCs w:val="28"/>
         </w:rPr>
-        <w:t xml:space="preserve">3.4. Estilo arquitectonico</w:t>
+        <w:t xml:space="preserve">3.4. Estilo arquitectónico</w:t>
       </w:r>
     </w:p>
     <w:p>
@@ -783,7 +783,7 @@
           <w:sz w:val="22"/>
           <w:szCs w:val="22"/>
         </w:rPr>
-        <w:t xml:space="preserve">El backend implementa un monolito modular con un unico modulo NestJS de dominio (AutosModule) que agrupa los controladores del contrato, los DTOs, las entidades TypeORM y los servicios de negocio. Se adopta el patron BFF (Backend For Frontend) para dos audiencias distintas: los endpoints publicos del contrato oficial (para el marketplace y la futura integracion Booking Prototipo) y los endpoints administrativos internos bajo /admin (fuera del contrato) que permiten operar el inventario. Un CommonModule reune los guards transversales (AffiliateGuard, IdempotencyKeyGuard, OAuth2Guard) y el filtro global de excepciones que serializa los errores en formato application/problem+json (RFC 7807).</w:t>
+        <w:t xml:space="preserve">El backend implementa un monolito modular con un único módulo NestJS de dominio (AutosModule) que agrupa los controladores del contrato, los DTOs, las entidades TypeORM y los servicios de negocio. Se adopta el patrón BFF (Backend For Frontend) para dos audiencias distintas: los endpoints públicos del contrato oficial (para el marketplace y la futura integración Booking Prototipo) y los endpoints administrativos internos bajo /admin (fuera del contrato) que permiten operar el inventario. Un CommonModule reune los guards transversales (AffiliateGuard, IdempotencyKeyGuard, OAuth2Guard) y el filtro global de excepciones que serializa los errores en formato application/problem+json (RFC 7807).</w:t>
       </w:r>
     </w:p>
     <w:p>
@@ -814,7 +814,7 @@
           <w:sz w:val="22"/>
           <w:szCs w:val="22"/>
         </w:rPr>
-        <w:t xml:space="preserve">El contrato oficial autos-openapi.yaml define 15 operaciones agrupadas en cinco tags. Todas ellas quedan implementadas 1:1 en el backend, respetando URLs, verbos HTTP, cabeceras obligatorias, esquemas de peticion, esquemas de respuesta, codigos de estado y encabezados de respuesta (incluido Cache-Control).</w:t>
+        <w:t xml:space="preserve">El contrato oficial autos-openapi.yaml define 15 operaciones agrupadas en cinco tags. Todas ellas quedan implementadas 1:1 en el backend, respetando URLs, verbos HTTP, cabeceras obligatorias, esquemas de petición, esquemas de respuesta, códigos de estado y encabezados de respuesta (incluido Cache-Control).</w:t>
       </w:r>
     </w:p>
     <w:p>
@@ -892,7 +892,7 @@
                 <w:sz w:val="22"/>
                 <w:szCs w:val="22"/>
               </w:rPr>
-              <w:t xml:space="preserve">Metodo</w:t>
+              <w:t xml:space="preserve">Método</w:t>
             </w:r>
           </w:p>
         </w:tc>
@@ -1863,7 +1863,7 @@
           <w:sz w:val="22"/>
           <w:szCs w:val="22"/>
         </w:rPr>
-        <w:t xml:space="preserve">AffiliateGuard: rechaza con 400 y ProblemDetails cuando falta o es invalido X-Affiliate-Id.</w:t>
+        <w:t xml:space="preserve">AffiliateGuard: rechaza con 400 y ProblemDetails cuando falta o es inválido X-Affiliate-Id.</w:t>
       </w:r>
     </w:p>
     <w:p>
@@ -1932,7 +1932,7 @@
           <w:sz w:val="22"/>
           <w:szCs w:val="22"/>
         </w:rPr>
-        <w:t xml:space="preserve">El filtro global ProblemDetailsFilter serializa toda excepcion en el formato application/problem+json exigido por components.responses.ProblemDetails*. Los codigos aceptados son los definidos en el contrato:</w:t>
+        <w:t xml:space="preserve">El filtro global ProblemDetailsFilter serializa toda excepción en el formato application/problem+json exigido por components.responses.ProblemDetails*. Los códigos aceptados son los definidos en el contrato:</w:t>
       </w:r>
     </w:p>
     <w:p>
@@ -2020,7 +2020,7 @@
           <w:sz w:val="22"/>
           <w:szCs w:val="22"/>
         </w:rPr>
-        <w:t xml:space="preserve">El OrderDetail responde con el campo _links siguiendo el nivel 3 del modelo de madurez de Richardson. Cuando el estado es CONFIRMED, se incluyen self, modify y cancel; cuando esta CANCELLED, solo self. Esto permite que el cliente descubra dinamicamente las acciones disponibles sin cablear URLs.</w:t>
+        <w:t xml:space="preserve">El OrderDetail responde con el campo _links siguiendo el nivel 3 del modelo de madurez de Richardson. Cuando el estado es CONFIRMED, se incluyen self, modify y cancel; cuando está CANCELLED, solo self. Esto permite que el cliente descubra dinámicamente las acciones disponibles sin cablear URLs.</w:t>
       </w:r>
     </w:p>
     <w:p>
@@ -2051,7 +2051,7 @@
           <w:sz w:val="22"/>
           <w:szCs w:val="22"/>
         </w:rPr>
-        <w:t xml:space="preserve">Peticion:</w:t>
+        <w:t xml:space="preserve">Petición:</w:t>
       </w:r>
     </w:p>
     <w:p>
@@ -2546,7 +2546,7 @@
           <w:sz w:val="22"/>
           <w:szCs w:val="22"/>
         </w:rPr>
-        <w:t xml:space="preserve">El modelo relacional interno se compone de ocho tablas dentro de una sola base de datos PostgreSQL, y cada una de ellas cuenta con su propia API CRUD administrativa bajo /api/v1/admin/*. Se mantienen los nombres de columna en ingles porque el contrato oficial (autos-openapi.yaml) tambien esta escrito en ingles, lo que reduce las conversiones entre capa de dominio y capa de exposicion.</w:t>
+        <w:t xml:space="preserve">El modelo relacional interno se compone de nueve tablas dentro de una sola base de datos PostgreSQL, y cada una de ellas cuenta con su propia API CRUD administrativa bajo /api/v1/admin/*. Se mantienen los nombres de columna en inglés porque el contrato oficial (autos-openapi.yaml) también está escrito en inglés, lo que reduce las conversiones entre capa de dominio y capa de exposición.</w:t>
       </w:r>
     </w:p>
     <w:p>
@@ -2820,7 +2820,7 @@
                 <w:sz w:val="22"/>
                 <w:szCs w:val="22"/>
               </w:rPr>
-              <w:t xml:space="preserve">Inventario de vehiculos</w:t>
+              <w:t xml:space="preserve">Inventario de vehículos</w:t>
             </w:r>
           </w:p>
         </w:tc>
@@ -2885,7 +2885,7 @@
                 <w:sz w:val="22"/>
                 <w:szCs w:val="22"/>
               </w:rPr>
-              <w:t xml:space="preserve">Galeria de imagenes</w:t>
+              <w:t xml:space="preserve">Galería de imágenes</w:t>
             </w:r>
           </w:p>
         </w:tc>
@@ -3080,7 +3080,7 @@
                 <w:sz w:val="22"/>
                 <w:szCs w:val="22"/>
               </w:rPr>
-              <w:t xml:space="preserve">Ordenes confirmadas</w:t>
+              <w:t xml:space="preserve">Órdenes confirmadas</w:t>
             </w:r>
           </w:p>
         </w:tc>
@@ -3167,6 +3167,71 @@
                 <w:szCs w:val="22"/>
               </w:rPr>
               <w:t xml:space="preserve">id (uuid), url, events, secret, active</w:t>
+            </w:r>
+          </w:p>
+        </w:tc>
+      </w:tr>
+      <w:tr>
+        <w:tc>
+          <w:tcPr>
+            <w:tcW w:type="dxa" w:w="2500"/>
+          </w:tcPr>
+          <w:p>
+            <w:pPr>
+              <w:spacing w:after="40"/>
+              <w:jc w:val="left"/>
+            </w:pPr>
+            <w:r>
+              <w:rPr>
+                <w:rFonts w:ascii="Arial" w:cs="Arial" w:eastAsia="Arial" w:hAnsi="Arial"/>
+                <w:b w:val="false"/>
+                <w:bCs w:val="false"/>
+                <w:sz w:val="22"/>
+                <w:szCs w:val="22"/>
+              </w:rPr>
+              <w:t xml:space="preserve">users</w:t>
+            </w:r>
+          </w:p>
+        </w:tc>
+        <w:tc>
+          <w:tcPr>
+            <w:tcW w:type="dxa" w:w="3400"/>
+          </w:tcPr>
+          <w:p>
+            <w:pPr>
+              <w:spacing w:after="40"/>
+              <w:jc w:val="left"/>
+            </w:pPr>
+            <w:r>
+              <w:rPr>
+                <w:rFonts w:ascii="Arial" w:cs="Arial" w:eastAsia="Arial" w:hAnsi="Arial"/>
+                <w:b w:val="false"/>
+                <w:bCs w:val="false"/>
+                <w:sz w:val="22"/>
+                <w:szCs w:val="22"/>
+              </w:rPr>
+              <w:t xml:space="preserve">Usuarios (clientes y administradores)</w:t>
+            </w:r>
+          </w:p>
+        </w:tc>
+        <w:tc>
+          <w:tcPr>
+            <w:tcW w:type="dxa" w:w="3400"/>
+          </w:tcPr>
+          <w:p>
+            <w:pPr>
+              <w:spacing w:after="40"/>
+              <w:jc w:val="left"/>
+            </w:pPr>
+            <w:r>
+              <w:rPr>
+                <w:rFonts w:ascii="Arial" w:cs="Arial" w:eastAsia="Arial" w:hAnsi="Arial"/>
+                <w:b w:val="false"/>
+                <w:bCs w:val="false"/>
+                <w:sz w:val="22"/>
+                <w:szCs w:val="22"/>
+              </w:rPr>
+              <w:t xml:space="preserve">user_id (uuid), first_name, last_name, email, password_hash, role, phone, national_id</w:t>
             </w:r>
           </w:p>
         </w:tc>
@@ -3205,83 +3270,140 @@
           <w:sz w:val="22"/>
           <w:szCs w:val="22"/>
         </w:rPr>
-        <w:t xml:space="preserve">El precio total de una preview se calcula como precio_por_dia por dias, mas 5 USD por cada extra por dia, mas 15% de impuestos.</w:t>
-      </w:r>
-    </w:p>
-    <w:p>
-      <w:pPr>
-        <w:pStyle w:val="ListParagraph"/>
-        <w:numPr>
-          <w:ilvl w:val="0"/>
-          <w:numId w:val="2"/>
-        </w:numPr>
-        <w:spacing w:after="80" w:line="280"/>
-        <w:jc w:val="both"/>
-      </w:pPr>
-      <w:r>
-        <w:rPr>
-          <w:rFonts w:ascii="Arial" w:cs="Arial" w:eastAsia="Arial" w:hAnsi="Arial"/>
-          <w:sz w:val="22"/>
-          <w:szCs w:val="22"/>
-        </w:rPr>
-        <w:t xml:space="preserve">Un vehiculo no puede ser reservado por dos ordenes CONFIRMED al mismo tiempo; al confirmar una orden se marca RESERVED y al cancelar vuelve a AVAILABLE.</w:t>
-      </w:r>
-    </w:p>
-    <w:p>
-      <w:pPr>
-        <w:pStyle w:val="ListParagraph"/>
-        <w:numPr>
-          <w:ilvl w:val="0"/>
-          <w:numId w:val="2"/>
-        </w:numPr>
-        <w:spacing w:after="80" w:line="280"/>
-        <w:jc w:val="both"/>
-      </w:pPr>
-      <w:r>
-        <w:rPr>
-          <w:rFonts w:ascii="Arial" w:cs="Arial" w:eastAsia="Arial" w:hAnsi="Arial"/>
-          <w:sz w:val="22"/>
-          <w:szCs w:val="22"/>
-        </w:rPr>
-        <w:t xml:space="preserve">Un hold expira automaticamente a los 15 minutos; una preview expira a los 30 minutos. Ambos plazos son configurables por constantes en el servicio.</w:t>
-      </w:r>
-    </w:p>
-    <w:p>
-      <w:pPr>
-        <w:pStyle w:val="ListParagraph"/>
-        <w:numPr>
-          <w:ilvl w:val="0"/>
-          <w:numId w:val="2"/>
-        </w:numPr>
-        <w:spacing w:after="80" w:line="280"/>
-        <w:jc w:val="both"/>
-      </w:pPr>
-      <w:r>
-        <w:rPr>
-          <w:rFonts w:ascii="Arial" w:cs="Arial" w:eastAsia="Arial" w:hAnsi="Arial"/>
-          <w:sz w:val="22"/>
-          <w:szCs w:val="22"/>
-        </w:rPr>
-        <w:t xml:space="preserve">Idempotency-Key se persiste en la tabla orders con indice unico; si llega una segunda peticion con la misma key el servicio devuelve la orden ya creada sin duplicar.</w:t>
-      </w:r>
-    </w:p>
-    <w:p>
-      <w:pPr>
-        <w:pStyle w:val="ListParagraph"/>
-        <w:numPr>
-          <w:ilvl w:val="0"/>
-          <w:numId w:val="2"/>
-        </w:numPr>
-        <w:spacing w:after="80" w:line="280"/>
-        <w:jc w:val="both"/>
-      </w:pPr>
-      <w:r>
-        <w:rPr>
-          <w:rFonts w:ascii="Arial" w:cs="Arial" w:eastAsia="Arial" w:hAnsi="Arial"/>
-          <w:sz w:val="22"/>
-          <w:szCs w:val="22"/>
-        </w:rPr>
-        <w:t xml:space="preserve">El campo owner_sub de la orden se obtiene del claim sub del JWT, cumpliendo el requisito del contrato: "El dueno de la reserva (ownerId) se infiere del sub del token JWT".</w:t>
+        <w:t xml:space="preserve">El precio total de una preview se calcula como precio_por_dia por días, más 5 USD por cada extra por día, más 15% de impuestos.</w:t>
+      </w:r>
+    </w:p>
+    <w:p>
+      <w:pPr>
+        <w:pStyle w:val="ListParagraph"/>
+        <w:numPr>
+          <w:ilvl w:val="0"/>
+          <w:numId w:val="2"/>
+        </w:numPr>
+        <w:spacing w:after="80" w:line="280"/>
+        <w:jc w:val="both"/>
+      </w:pPr>
+      <w:r>
+        <w:rPr>
+          <w:rFonts w:ascii="Arial" w:cs="Arial" w:eastAsia="Arial" w:hAnsi="Arial"/>
+          <w:sz w:val="22"/>
+          <w:szCs w:val="22"/>
+        </w:rPr>
+        <w:t xml:space="preserve">Un vehículo no puede ser reservado por dos órdenes CONFIRMED al mismo tiempo; al confirmar una orden se marca RESERVED y al cancelar vuelve a AVAILABLE.</w:t>
+      </w:r>
+    </w:p>
+    <w:p>
+      <w:pPr>
+        <w:pStyle w:val="ListParagraph"/>
+        <w:numPr>
+          <w:ilvl w:val="0"/>
+          <w:numId w:val="2"/>
+        </w:numPr>
+        <w:spacing w:after="80" w:line="280"/>
+        <w:jc w:val="both"/>
+      </w:pPr>
+      <w:r>
+        <w:rPr>
+          <w:rFonts w:ascii="Arial" w:cs="Arial" w:eastAsia="Arial" w:hAnsi="Arial"/>
+          <w:sz w:val="22"/>
+          <w:szCs w:val="22"/>
+        </w:rPr>
+        <w:t xml:space="preserve">Un hold expira automáticamente a los 15 minutos; una preview expira a los 30 minutos. Ambos plazos son configurables por constantes en el servicio.</w:t>
+      </w:r>
+    </w:p>
+    <w:p>
+      <w:pPr>
+        <w:pStyle w:val="ListParagraph"/>
+        <w:numPr>
+          <w:ilvl w:val="0"/>
+          <w:numId w:val="2"/>
+        </w:numPr>
+        <w:spacing w:after="80" w:line="280"/>
+        <w:jc w:val="both"/>
+      </w:pPr>
+      <w:r>
+        <w:rPr>
+          <w:rFonts w:ascii="Arial" w:cs="Arial" w:eastAsia="Arial" w:hAnsi="Arial"/>
+          <w:sz w:val="22"/>
+          <w:szCs w:val="22"/>
+        </w:rPr>
+        <w:t xml:space="preserve">Idempotency-Key se persiste en la tabla orders con índice único; si llega una segunda petición con la misma key el servicio devuelve la orden ya creada sin duplicar.</w:t>
+      </w:r>
+    </w:p>
+    <w:p>
+      <w:pPr>
+        <w:pStyle w:val="ListParagraph"/>
+        <w:numPr>
+          <w:ilvl w:val="0"/>
+          <w:numId w:val="2"/>
+        </w:numPr>
+        <w:spacing w:after="80" w:line="280"/>
+        <w:jc w:val="both"/>
+      </w:pPr>
+      <w:r>
+        <w:rPr>
+          <w:rFonts w:ascii="Arial" w:cs="Arial" w:eastAsia="Arial" w:hAnsi="Arial"/>
+          <w:sz w:val="22"/>
+          <w:szCs w:val="22"/>
+        </w:rPr>
+        <w:t xml:space="preserve">El campo owner_sub de la orden se obtiene del claim sub del JWT, cumpliendo el requisito del contrato: "El dueño de la reserva (ownerId) se infiere del sub del token JWT".</w:t>
+      </w:r>
+    </w:p>
+    <w:p>
+      <w:pPr>
+        <w:pStyle w:val="ListParagraph"/>
+        <w:numPr>
+          <w:ilvl w:val="0"/>
+          <w:numId w:val="2"/>
+        </w:numPr>
+        <w:spacing w:after="80" w:line="280"/>
+        <w:jc w:val="both"/>
+      </w:pPr>
+      <w:r>
+        <w:rPr>
+          <w:rFonts w:ascii="Arial" w:cs="Arial" w:eastAsia="Arial" w:hAnsi="Arial"/>
+          <w:sz w:val="22"/>
+          <w:szCs w:val="22"/>
+        </w:rPr>
+        <w:t xml:space="preserve">Fechas de alquiler: en /orders/preview, /orders/create y en la modificación de ruta la fecha de inicio no puede ser anterior a hoy (UTC, con un día de tolerancia por zonas horarias), la fecha de fin debe ser posterior a la de inicio y el alquiler dura como máximo 90 días. Si no se cumple se responde 400 con code VALIDATION_FAILED y el motivo en detail.</w:t>
+      </w:r>
+    </w:p>
+    <w:p>
+      <w:pPr>
+        <w:pStyle w:val="ListParagraph"/>
+        <w:numPr>
+          <w:ilvl w:val="0"/>
+          <w:numId w:val="2"/>
+        </w:numPr>
+        <w:spacing w:after="80" w:line="280"/>
+        <w:jc w:val="both"/>
+      </w:pPr>
+      <w:r>
+        <w:rPr>
+          <w:rFonts w:ascii="Arial" w:cs="Arial" w:eastAsia="Arial" w:hAnsi="Arial"/>
+          <w:sz w:val="22"/>
+          <w:szCs w:val="22"/>
+        </w:rPr>
+        <w:t xml:space="preserve">El enum de OrderDetail.status del contrato (CONFIRMED, CANCELLED, PENDING) no se modifica: "Finalizada" es un estado solo de presentación para las órdenes CONFIRMED cuya fecha de devolución ya pasó. Esas órdenes siguen sumando ingresos y ya no bloquean el vehículo en /search.</w:t>
+      </w:r>
+    </w:p>
+    <w:p>
+      <w:pPr>
+        <w:pStyle w:val="ListParagraph"/>
+        <w:numPr>
+          <w:ilvl w:val="0"/>
+          <w:numId w:val="2"/>
+        </w:numPr>
+        <w:spacing w:after="80" w:line="280"/>
+        <w:jc w:val="both"/>
+      </w:pPr>
+      <w:r>
+        <w:rPr>
+          <w:rFonts w:ascii="Arial" w:cs="Arial" w:eastAsia="Arial" w:hAnsi="Arial"/>
+          <w:sz w:val="22"/>
+          <w:szCs w:val="22"/>
+        </w:rPr>
+        <w:t xml:space="preserve">El seed es idempotente y se ejecuta en cada arranque: crea los usuarios demo y 12 reservas históricas finalizadas de los clientes maria y carlos (marcadas con idempotency_key seed-hist-NN para no duplicarlas), de modo que el panel de control muestra ingresos reales.</w:t>
       </w:r>
     </w:p>
     <w:p>
@@ -3312,7 +3434,7 @@
           <w:sz w:val="22"/>
           <w:szCs w:val="22"/>
         </w:rPr>
-        <w:t xml:space="preserve">Ademas de los 15 endpoints del contrato, el backend expone una API CRUD por cada una de las ocho tablas, protegida con JWT y el scope autos:webhooks. Cada API ofrece </w:t>
+        <w:t xml:space="preserve">Además de los 15 endpoints del contrato, el backend expone una API CRUD por cada una de las nueve tablas, protegida con JWT y el scope autos:webhooks. Cada API ofrece </w:t>
       </w:r>
       <w:r>
         <w:rPr>
@@ -3677,6 +3799,41 @@
     </w:p>
     <w:p>
       <w:pPr>
+        <w:pStyle w:val="ListParagraph"/>
+        <w:numPr>
+          <w:ilvl w:val="0"/>
+          <w:numId w:val="2"/>
+        </w:numPr>
+        <w:spacing w:after="80" w:line="280"/>
+        <w:jc w:val="both"/>
+      </w:pPr>
+      <w:r>
+        <w:rPr>
+          <w:rFonts w:ascii="Arial" w:cs="Arial" w:eastAsia="Arial" w:hAnsi="Arial"/>
+          <w:sz w:val="22"/>
+          <w:szCs w:val="22"/>
+        </w:rPr>
+        <w:t xml:space="preserve">users: </w:t>
+      </w:r>
+      <w:r>
+        <w:rPr>
+          <w:rFonts w:ascii="Courier New" w:cs="Courier New" w:eastAsia="Courier New" w:hAnsi="Courier New"/>
+          <w:sz w:val="22"/>
+          <w:szCs w:val="22"/>
+        </w:rPr>
+        <w:t xml:space="preserve">/api/v1/admin/users</w:t>
+      </w:r>
+      <w:r>
+        <w:rPr>
+          <w:rFonts w:ascii="Arial" w:cs="Arial" w:eastAsia="Arial" w:hAnsi="Arial"/>
+          <w:sz w:val="22"/>
+          <w:szCs w:val="22"/>
+        </w:rPr>
+        <w:t xml:space="preserve"> (contraseñas con hash scrypt; el hash nunca se devuelve).</w:t>
+      </w:r>
+    </w:p>
+    <w:p>
+      <w:pPr>
         <w:spacing w:after="160" w:line="300"/>
         <w:jc w:val="both"/>
       </w:pPr>
@@ -3702,7 +3859,7 @@
           <w:sz w:val="22"/>
           <w:szCs w:val="22"/>
         </w:rPr>
-        <w:t xml:space="preserve"> devuelve los conteos de las ocho tablas y los ingresos confirmados para el dashboard.</w:t>
+        <w:t xml:space="preserve"> devuelve los conteos de las nueve tablas, las órdenes finalizadas y los ingresos confirmados para el panel de control.</w:t>
       </w:r>
     </w:p>
     <w:p>
@@ -3736,121 +3893,121 @@
           <w:sz w:val="28"/>
           <w:szCs w:val="28"/>
         </w:rPr>
-        <w:t xml:space="preserve">6.1. Estructura de paginas publicas</w:t>
-      </w:r>
-    </w:p>
-    <w:p>
-      <w:pPr>
-        <w:pStyle w:val="ListParagraph"/>
-        <w:numPr>
-          <w:ilvl w:val="0"/>
-          <w:numId w:val="2"/>
-        </w:numPr>
-        <w:spacing w:after="80" w:line="280"/>
-        <w:jc w:val="both"/>
-      </w:pPr>
-      <w:r>
-        <w:rPr>
-          <w:rFonts w:ascii="Arial" w:cs="Arial" w:eastAsia="Arial" w:hAnsi="Arial"/>
-          <w:sz w:val="22"/>
-          <w:szCs w:val="22"/>
-        </w:rPr>
-        <w:t xml:space="preserve">Home: hero con formulario de busqueda por agencia, fechas y edad; exploracion por categoria y vehiculos destacados.</w:t>
-      </w:r>
-    </w:p>
-    <w:p>
-      <w:pPr>
-        <w:pStyle w:val="ListParagraph"/>
-        <w:numPr>
-          <w:ilvl w:val="0"/>
-          <w:numId w:val="2"/>
-        </w:numPr>
-        <w:spacing w:after="80" w:line="280"/>
-        <w:jc w:val="both"/>
-      </w:pPr>
-      <w:r>
-        <w:rPr>
-          <w:rFonts w:ascii="Arial" w:cs="Arial" w:eastAsia="Arial" w:hAnsi="Arial"/>
-          <w:sz w:val="22"/>
-          <w:szCs w:val="22"/>
-        </w:rPr>
-        <w:t xml:space="preserve">Catalogo: listado filtrable resultado directo de POST /search del contrato oficial. Filtros: agencia, fechas, edad, categoria y transmision.</w:t>
-      </w:r>
-    </w:p>
-    <w:p>
-      <w:pPr>
-        <w:pStyle w:val="ListParagraph"/>
-        <w:numPr>
-          <w:ilvl w:val="0"/>
-          <w:numId w:val="2"/>
-        </w:numPr>
-        <w:spacing w:after="80" w:line="280"/>
-        <w:jc w:val="both"/>
-      </w:pPr>
-      <w:r>
-        <w:rPr>
-          <w:rFonts w:ascii="Arial" w:cs="Arial" w:eastAsia="Arial" w:hAnsi="Arial"/>
-          <w:sz w:val="22"/>
-          <w:szCs w:val="22"/>
-        </w:rPr>
-        <w:t xml:space="preserve">Detalle de vehiculo: galeria, ficha tecnica y flujo de reserva en tres pasos: hold, preview y create, todos ejecutados contra los endpoints del contrato.</w:t>
-      </w:r>
-    </w:p>
-    <w:p>
-      <w:pPr>
-        <w:pStyle w:val="ListParagraph"/>
-        <w:numPr>
-          <w:ilvl w:val="0"/>
-          <w:numId w:val="2"/>
-        </w:numPr>
-        <w:spacing w:after="80" w:line="280"/>
-        <w:jc w:val="both"/>
-      </w:pPr>
-      <w:r>
-        <w:rPr>
-          <w:rFonts w:ascii="Arial" w:cs="Arial" w:eastAsia="Arial" w:hAnsi="Arial"/>
-          <w:sz w:val="22"/>
-          <w:szCs w:val="22"/>
-        </w:rPr>
-        <w:t xml:space="preserve">Login: autenticacion contra el Authorization Server local (POST /auth/token) que devuelve un JWT con scopes.</w:t>
-      </w:r>
-    </w:p>
-    <w:p>
-      <w:pPr>
-        <w:pStyle w:val="ListParagraph"/>
-        <w:numPr>
-          <w:ilvl w:val="0"/>
-          <w:numId w:val="2"/>
-        </w:numPr>
-        <w:spacing w:after="80" w:line="280"/>
-        <w:jc w:val="both"/>
-      </w:pPr>
-      <w:r>
-        <w:rPr>
-          <w:rFonts w:ascii="Arial" w:cs="Arial" w:eastAsia="Arial" w:hAnsi="Arial"/>
-          <w:sz w:val="22"/>
-          <w:szCs w:val="22"/>
-        </w:rPr>
-        <w:t xml:space="preserve">Mis reservas: listado de ordenes creadas por el cliente, con opcion de cancelacion via POST /orders/{orderId}/cancel.</w:t>
-      </w:r>
-    </w:p>
-    <w:p>
-      <w:pPr>
-        <w:pStyle w:val="ListParagraph"/>
-        <w:numPr>
-          <w:ilvl w:val="0"/>
-          <w:numId w:val="2"/>
-        </w:numPr>
-        <w:spacing w:after="80" w:line="280"/>
-        <w:jc w:val="both"/>
-      </w:pPr>
-      <w:r>
-        <w:rPr>
-          <w:rFonts w:ascii="Arial" w:cs="Arial" w:eastAsia="Arial" w:hAnsi="Arial"/>
-          <w:sz w:val="22"/>
-          <w:szCs w:val="22"/>
-        </w:rPr>
-        <w:t xml:space="preserve">Confirmacion: pantalla que muestra locator (PNR), order_id, estado y total tras un create exitoso.</w:t>
+        <w:t xml:space="preserve">6.1. Estructura de páginas públicas</w:t>
+      </w:r>
+    </w:p>
+    <w:p>
+      <w:pPr>
+        <w:pStyle w:val="ListParagraph"/>
+        <w:numPr>
+          <w:ilvl w:val="0"/>
+          <w:numId w:val="2"/>
+        </w:numPr>
+        <w:spacing w:after="80" w:line="280"/>
+        <w:jc w:val="both"/>
+      </w:pPr>
+      <w:r>
+        <w:rPr>
+          <w:rFonts w:ascii="Arial" w:cs="Arial" w:eastAsia="Arial" w:hAnsi="Arial"/>
+          <w:sz w:val="22"/>
+          <w:szCs w:val="22"/>
+        </w:rPr>
+        <w:t xml:space="preserve">Home: hero con formulario de búsqueda por agencia, fechas y edad; exploración por categoría y vehículos destacados.</w:t>
+      </w:r>
+    </w:p>
+    <w:p>
+      <w:pPr>
+        <w:pStyle w:val="ListParagraph"/>
+        <w:numPr>
+          <w:ilvl w:val="0"/>
+          <w:numId w:val="2"/>
+        </w:numPr>
+        <w:spacing w:after="80" w:line="280"/>
+        <w:jc w:val="both"/>
+      </w:pPr>
+      <w:r>
+        <w:rPr>
+          <w:rFonts w:ascii="Arial" w:cs="Arial" w:eastAsia="Arial" w:hAnsi="Arial"/>
+          <w:sz w:val="22"/>
+          <w:szCs w:val="22"/>
+        </w:rPr>
+        <w:t xml:space="preserve">Catálogo: listado filtrable resultado directo de POST /search del contrato oficial. Filtros: agencia, fechas, edad, categoría y transmisión.</w:t>
+      </w:r>
+    </w:p>
+    <w:p>
+      <w:pPr>
+        <w:pStyle w:val="ListParagraph"/>
+        <w:numPr>
+          <w:ilvl w:val="0"/>
+          <w:numId w:val="2"/>
+        </w:numPr>
+        <w:spacing w:after="80" w:line="280"/>
+        <w:jc w:val="both"/>
+      </w:pPr>
+      <w:r>
+        <w:rPr>
+          <w:rFonts w:ascii="Arial" w:cs="Arial" w:eastAsia="Arial" w:hAnsi="Arial"/>
+          <w:sz w:val="22"/>
+          <w:szCs w:val="22"/>
+        </w:rPr>
+        <w:t xml:space="preserve">Detalle de vehículo: galería, ficha técnica y flujo de reserva en tres pasos: hold, preview y create, todos ejecutados contra los endpoints del contrato.</w:t>
+      </w:r>
+    </w:p>
+    <w:p>
+      <w:pPr>
+        <w:pStyle w:val="ListParagraph"/>
+        <w:numPr>
+          <w:ilvl w:val="0"/>
+          <w:numId w:val="2"/>
+        </w:numPr>
+        <w:spacing w:after="80" w:line="280"/>
+        <w:jc w:val="both"/>
+      </w:pPr>
+      <w:r>
+        <w:rPr>
+          <w:rFonts w:ascii="Arial" w:cs="Arial" w:eastAsia="Arial" w:hAnsi="Arial"/>
+          <w:sz w:val="22"/>
+          <w:szCs w:val="22"/>
+        </w:rPr>
+        <w:t xml:space="preserve">Login: autenticación contra el Authorization Server local (POST /auth/token), que valida las credenciales contra la tabla users y devuelve un JWT con scopes.</w:t>
+      </w:r>
+    </w:p>
+    <w:p>
+      <w:pPr>
+        <w:pStyle w:val="ListParagraph"/>
+        <w:numPr>
+          <w:ilvl w:val="0"/>
+          <w:numId w:val="2"/>
+        </w:numPr>
+        <w:spacing w:after="80" w:line="280"/>
+        <w:jc w:val="both"/>
+      </w:pPr>
+      <w:r>
+        <w:rPr>
+          <w:rFonts w:ascii="Arial" w:cs="Arial" w:eastAsia="Arial" w:hAnsi="Arial"/>
+          <w:sz w:val="22"/>
+          <w:szCs w:val="22"/>
+        </w:rPr>
+        <w:t xml:space="preserve">Mis reservas: listado de las órdenes del cliente obtenido de GET /account/orders (dueño = sub del token, desde cualquier dispositivo), con estado Confirmada, Finalizada o Cancelada y opción de cancelación vía POST /orders/{orderId}/cancel.</w:t>
+      </w:r>
+    </w:p>
+    <w:p>
+      <w:pPr>
+        <w:pStyle w:val="ListParagraph"/>
+        <w:numPr>
+          <w:ilvl w:val="0"/>
+          <w:numId w:val="2"/>
+        </w:numPr>
+        <w:spacing w:after="80" w:line="280"/>
+        <w:jc w:val="both"/>
+      </w:pPr>
+      <w:r>
+        <w:rPr>
+          <w:rFonts w:ascii="Arial" w:cs="Arial" w:eastAsia="Arial" w:hAnsi="Arial"/>
+          <w:sz w:val="22"/>
+          <w:szCs w:val="22"/>
+        </w:rPr>
+        <w:t xml:space="preserve">Confirmación: pantalla que muestra locator (PNR), order_id, estado y total tras un create exitoso.</w:t>
       </w:r>
     </w:p>
     <w:p>
@@ -3886,83 +4043,102 @@
           <w:sz w:val="22"/>
           <w:szCs w:val="22"/>
         </w:rPr>
-        <w:t xml:space="preserve">Dashboard: tarjetas con conteos de vehiculos, agencias, proveedores y ordenes, e ingresos acumulados.</w:t>
-      </w:r>
-    </w:p>
-    <w:p>
-      <w:pPr>
-        <w:pStyle w:val="ListParagraph"/>
-        <w:numPr>
-          <w:ilvl w:val="0"/>
-          <w:numId w:val="2"/>
-        </w:numPr>
-        <w:spacing w:after="80" w:line="280"/>
-        <w:jc w:val="both"/>
-      </w:pPr>
-      <w:r>
-        <w:rPr>
-          <w:rFonts w:ascii="Arial" w:cs="Arial" w:eastAsia="Arial" w:hAnsi="Arial"/>
-          <w:sz w:val="22"/>
-          <w:szCs w:val="22"/>
-        </w:rPr>
-        <w:t xml:space="preserve">Vehiculos: CRUD completo con selectores de agencia y proveedor.</w:t>
-      </w:r>
-    </w:p>
-    <w:p>
-      <w:pPr>
-        <w:pStyle w:val="ListParagraph"/>
-        <w:numPr>
-          <w:ilvl w:val="0"/>
-          <w:numId w:val="2"/>
-        </w:numPr>
-        <w:spacing w:after="80" w:line="280"/>
-        <w:jc w:val="both"/>
-      </w:pPr>
-      <w:r>
-        <w:rPr>
-          <w:rFonts w:ascii="Arial" w:cs="Arial" w:eastAsia="Arial" w:hAnsi="Arial"/>
-          <w:sz w:val="22"/>
-          <w:szCs w:val="22"/>
-        </w:rPr>
-        <w:t xml:space="preserve">Agencias (depots): CRUD basico incluyendo codigo IATA y coordenadas.</w:t>
-      </w:r>
-    </w:p>
-    <w:p>
-      <w:pPr>
-        <w:pStyle w:val="ListParagraph"/>
-        <w:numPr>
-          <w:ilvl w:val="0"/>
-          <w:numId w:val="2"/>
-        </w:numPr>
-        <w:spacing w:after="80" w:line="280"/>
-        <w:jc w:val="both"/>
-      </w:pPr>
-      <w:r>
-        <w:rPr>
-          <w:rFonts w:ascii="Arial" w:cs="Arial" w:eastAsia="Arial" w:hAnsi="Arial"/>
-          <w:sz w:val="22"/>
-          <w:szCs w:val="22"/>
-        </w:rPr>
-        <w:t xml:space="preserve">Proveedores: CRUD basico.</w:t>
-      </w:r>
-    </w:p>
-    <w:p>
-      <w:pPr>
-        <w:pStyle w:val="ListParagraph"/>
-        <w:numPr>
-          <w:ilvl w:val="0"/>
-          <w:numId w:val="2"/>
-        </w:numPr>
-        <w:spacing w:after="80" w:line="280"/>
-        <w:jc w:val="both"/>
-      </w:pPr>
-      <w:r>
-        <w:rPr>
-          <w:rFonts w:ascii="Arial" w:cs="Arial" w:eastAsia="Arial" w:hAnsi="Arial"/>
-          <w:sz w:val="22"/>
-          <w:szCs w:val="22"/>
-        </w:rPr>
-        <w:t xml:space="preserve">Ordenes: listado filtrable por estado y accion de cancelar.</w:t>
+        <w:t xml:space="preserve">Panel de control: tarjetas con conteos de vehículos, agencias, proveedores, usuarios y órdenes (confirmadas y finalizadas) e ingresos totales reales, más el botón "+ Nuevo cliente".</w:t>
+      </w:r>
+    </w:p>
+    <w:p>
+      <w:pPr>
+        <w:pStyle w:val="ListParagraph"/>
+        <w:numPr>
+          <w:ilvl w:val="0"/>
+          <w:numId w:val="2"/>
+        </w:numPr>
+        <w:spacing w:after="80" w:line="280"/>
+        <w:jc w:val="both"/>
+      </w:pPr>
+      <w:r>
+        <w:rPr>
+          <w:rFonts w:ascii="Arial" w:cs="Arial" w:eastAsia="Arial" w:hAnsi="Arial"/>
+          <w:sz w:val="22"/>
+          <w:szCs w:val="22"/>
+        </w:rPr>
+        <w:t xml:space="preserve">Usuarios: alta, edición y eliminación de clientes y administradores en una ventana modal accesible, con validación de correo y cédula, contraseña de mínimo 8 caracteres, botón "Generar contraseña aleatoria" y, al crear, las credenciales en pantalla con el botón "Copiar credenciales".</w:t>
+      </w:r>
+    </w:p>
+    <w:p>
+      <w:pPr>
+        <w:pStyle w:val="ListParagraph"/>
+        <w:numPr>
+          <w:ilvl w:val="0"/>
+          <w:numId w:val="2"/>
+        </w:numPr>
+        <w:spacing w:after="80" w:line="280"/>
+        <w:jc w:val="both"/>
+      </w:pPr>
+      <w:r>
+        <w:rPr>
+          <w:rFonts w:ascii="Arial" w:cs="Arial" w:eastAsia="Arial" w:hAnsi="Arial"/>
+          <w:sz w:val="22"/>
+          <w:szCs w:val="22"/>
+        </w:rPr>
+        <w:t xml:space="preserve">Vehículos: CRUD completo con selectores de agencia y proveedor.</w:t>
+      </w:r>
+    </w:p>
+    <w:p>
+      <w:pPr>
+        <w:pStyle w:val="ListParagraph"/>
+        <w:numPr>
+          <w:ilvl w:val="0"/>
+          <w:numId w:val="2"/>
+        </w:numPr>
+        <w:spacing w:after="80" w:line="280"/>
+        <w:jc w:val="both"/>
+      </w:pPr>
+      <w:r>
+        <w:rPr>
+          <w:rFonts w:ascii="Arial" w:cs="Arial" w:eastAsia="Arial" w:hAnsi="Arial"/>
+          <w:sz w:val="22"/>
+          <w:szCs w:val="22"/>
+        </w:rPr>
+        <w:t xml:space="preserve">Agencias (depots): CRUD básico incluyendo código IATA y coordenadas.</w:t>
+      </w:r>
+    </w:p>
+    <w:p>
+      <w:pPr>
+        <w:pStyle w:val="ListParagraph"/>
+        <w:numPr>
+          <w:ilvl w:val="0"/>
+          <w:numId w:val="2"/>
+        </w:numPr>
+        <w:spacing w:after="80" w:line="280"/>
+        <w:jc w:val="both"/>
+      </w:pPr>
+      <w:r>
+        <w:rPr>
+          <w:rFonts w:ascii="Arial" w:cs="Arial" w:eastAsia="Arial" w:hAnsi="Arial"/>
+          <w:sz w:val="22"/>
+          <w:szCs w:val="22"/>
+        </w:rPr>
+        <w:t xml:space="preserve">Proveedores: CRUD básico.</w:t>
+      </w:r>
+    </w:p>
+    <w:p>
+      <w:pPr>
+        <w:pStyle w:val="ListParagraph"/>
+        <w:numPr>
+          <w:ilvl w:val="0"/>
+          <w:numId w:val="2"/>
+        </w:numPr>
+        <w:spacing w:after="80" w:line="280"/>
+        <w:jc w:val="both"/>
+      </w:pPr>
+      <w:r>
+        <w:rPr>
+          <w:rFonts w:ascii="Arial" w:cs="Arial" w:eastAsia="Arial" w:hAnsi="Arial"/>
+          <w:sz w:val="22"/>
+          <w:szCs w:val="22"/>
+        </w:rPr>
+        <w:t xml:space="preserve">Órdenes: listado filtrable por estado y acción de cancelar.</w:t>
       </w:r>
     </w:p>
     <w:p>
@@ -3993,7 +4169,7 @@
           <w:sz w:val="22"/>
           <w:szCs w:val="22"/>
         </w:rPr>
-        <w:t xml:space="preserve">La aplicacion se disena mobile-first utilizando CSS Grid y Flexbox con puntos de quiebre en 640 y 900 pixeles. La barra de navegacion colapsa en un menu hamburguesa en pantallas pequenas, el detalle del vehiculo pasa de dos columnas a una en anchos menores a 820 pixeles, y todas las imagenes utilizan atributos loading="lazy" y object-fit para preservar proporciones sin deformarse.</w:t>
+        <w:t xml:space="preserve">La aplicación se diseña mobile-first utilizando CSS Grid y Flexbox con puntos de quiebre en 640 y 900 píxeles. La barra de navegación colapsa en un menu hamburguesa en pantallas pequeñas, el detalle del vehículo pasa de dos columnas a una en anchos menores a 820 píxeles, y todas las imágenes utilizan atributos loading="lazy" y object-fit para preservar proporciones sin deformarse.</w:t>
       </w:r>
     </w:p>
     <w:p>
@@ -4024,7 +4200,7 @@
           <w:sz w:val="22"/>
           <w:szCs w:val="22"/>
         </w:rPr>
-        <w:t xml:space="preserve">El contrato oficial declara en su descripcion que la logica de pagos pertenece a otros dominios/APIs: /orders/create solo recibe un payment_reference ya autorizado. Por ello el frontend implementa un simulador de pagos que se abre como ventana modal entre la previsualizacion y la creacion de la orden, y genera un payment_reference valido con el formato </w:t>
+        <w:t xml:space="preserve">El contrato oficial declara en su descripción que la lógica de pagos pertenece a otros dominios/APIs: /orders/create solo recibe un payment_reference ya autorizado. Por ello el frontend implementa un simulador de pagos que se abre como ventana modal entre la previsualización y la creación de la orden, y genera un payment_reference válido con el formato </w:t>
       </w:r>
       <w:r>
         <w:rPr>
@@ -4059,26 +4235,26 @@
           <w:sz w:val="22"/>
           <w:szCs w:val="22"/>
         </w:rPr>
-        <w:t xml:space="preserve">Campos: numero de tarjeta de 16 digitos con mascara 4-4-4-4 y validacion con el algoritmo de Luhn, nombre del titular (minimo 3 caracteres), fecha de expiracion MM/AA que rechaza fechas vencidas y CVV de 3 digitos.</w:t>
-      </w:r>
-    </w:p>
-    <w:p>
-      <w:pPr>
-        <w:pStyle w:val="ListParagraph"/>
-        <w:numPr>
-          <w:ilvl w:val="0"/>
-          <w:numId w:val="2"/>
-        </w:numPr>
-        <w:spacing w:after="80" w:line="280"/>
-        <w:jc w:val="both"/>
-      </w:pPr>
-      <w:r>
-        <w:rPr>
-          <w:rFonts w:ascii="Arial" w:cs="Arial" w:eastAsia="Arial" w:hAnsi="Arial"/>
-          <w:sz w:val="22"/>
-          <w:szCs w:val="22"/>
-        </w:rPr>
-        <w:t xml:space="preserve">Muestra el total a cobrar tomado de preview.data.total_price y un aviso visible de modo simulador: ningun cargo real se procesa y los datos de la tarjeta nunca se envian al backend.</w:t>
+        <w:t xml:space="preserve">Campos: número de tarjeta de 16 dígitos con máscara 4-4-4-4 y validación con el algoritmo de Luhn, nombre del titular (mínimo 3 caracteres), fecha de expiración MM/AA que rechaza fechas vencidas y CVV de 3 dígitos.</w:t>
+      </w:r>
+    </w:p>
+    <w:p>
+      <w:pPr>
+        <w:pStyle w:val="ListParagraph"/>
+        <w:numPr>
+          <w:ilvl w:val="0"/>
+          <w:numId w:val="2"/>
+        </w:numPr>
+        <w:spacing w:after="80" w:line="280"/>
+        <w:jc w:val="both"/>
+      </w:pPr>
+      <w:r>
+        <w:rPr>
+          <w:rFonts w:ascii="Arial" w:cs="Arial" w:eastAsia="Arial" w:hAnsi="Arial"/>
+          <w:sz w:val="22"/>
+          <w:szCs w:val="22"/>
+        </w:rPr>
+        <w:t xml:space="preserve">Muestra el total a cobrar tomado de preview.data.total_price y un aviso visible de modo simulador: ningún cargo real se procesa y los datos de la tarjeta nunca se envian al backend.</w:t>
       </w:r>
     </w:p>
     <w:p>
@@ -4113,7 +4289,7 @@
           <w:sz w:val="22"/>
           <w:szCs w:val="22"/>
         </w:rPr>
-        <w:t xml:space="preserve">, expiracion </w:t>
+        <w:t xml:space="preserve">, expiración </w:t>
       </w:r>
       <w:r>
         <w:rPr>
@@ -4145,7 +4321,7 @@
           <w:sz w:val="22"/>
           <w:szCs w:val="22"/>
         </w:rPr>
-        <w:t xml:space="preserve">. El boton "Usar tarjeta de prueba" autollena los cuatro campos.</w:t>
+        <w:t xml:space="preserve">. El botón "Usar tarjeta de prueba" autollena los cuatro campos.</w:t>
       </w:r>
     </w:p>
     <w:p>
@@ -4195,7 +4371,7 @@
           <w:sz w:val="22"/>
           <w:szCs w:val="22"/>
         </w:rPr>
-        <w:t xml:space="preserve">Todo el sitio puede recorrerse unicamente con el teclado (Tab, Shift+Tab, Enter, Espacio y Escape):</w:t>
+        <w:t xml:space="preserve">Todo el sitio puede recorrerse únicamente con el teclado (Tab, Shift+Tab, Enter, Espacio y Escape):</w:t>
       </w:r>
     </w:p>
     <w:p>
@@ -4233,45 +4409,45 @@
           <w:sz w:val="22"/>
           <w:szCs w:val="22"/>
         </w:rPr>
-        <w:t xml:space="preserve">Anillo de foco ambar visible en todos los elementos interactivos, incluido el navbar oscuro y el icono de calendario de los campos de fecha de Chrome.</w:t>
-      </w:r>
-    </w:p>
-    <w:p>
-      <w:pPr>
-        <w:pStyle w:val="ListParagraph"/>
-        <w:numPr>
-          <w:ilvl w:val="0"/>
-          <w:numId w:val="2"/>
-        </w:numPr>
-        <w:spacing w:after="80" w:line="280"/>
-        <w:jc w:val="both"/>
-      </w:pPr>
-      <w:r>
-        <w:rPr>
-          <w:rFonts w:ascii="Arial" w:cs="Arial" w:eastAsia="Arial" w:hAnsi="Arial"/>
-          <w:sz w:val="22"/>
-          <w:szCs w:val="22"/>
-        </w:rPr>
-        <w:t xml:space="preserve">Al cambiar de pagina el foco pasa al contenido principal, de modo que la navegacion continua desde la nueva vista.</w:t>
-      </w:r>
-    </w:p>
-    <w:p>
-      <w:pPr>
-        <w:pStyle w:val="ListParagraph"/>
-        <w:numPr>
-          <w:ilvl w:val="0"/>
-          <w:numId w:val="2"/>
-        </w:numPr>
-        <w:spacing w:after="80" w:line="280"/>
-        <w:jc w:val="both"/>
-      </w:pPr>
-      <w:r>
-        <w:rPr>
-          <w:rFonts w:ascii="Arial" w:cs="Arial" w:eastAsia="Arial" w:hAnsi="Arial"/>
-          <w:sz w:val="22"/>
-          <w:szCs w:val="22"/>
-        </w:rPr>
-        <w:t xml:space="preserve">Menu movil accesible: se abre con Enter llevando el foco al primer enlace, se cierra con Escape devolviendo el foco al boton, y expone aria-expanded.</w:t>
+        <w:t xml:space="preserve">Anillo de foco ámbar visible en todos los elementos interactivos, incluido el navbar oscuro y el icono de calendario de los campos de fecha de Chrome.</w:t>
+      </w:r>
+    </w:p>
+    <w:p>
+      <w:pPr>
+        <w:pStyle w:val="ListParagraph"/>
+        <w:numPr>
+          <w:ilvl w:val="0"/>
+          <w:numId w:val="2"/>
+        </w:numPr>
+        <w:spacing w:after="80" w:line="280"/>
+        <w:jc w:val="both"/>
+      </w:pPr>
+      <w:r>
+        <w:rPr>
+          <w:rFonts w:ascii="Arial" w:cs="Arial" w:eastAsia="Arial" w:hAnsi="Arial"/>
+          <w:sz w:val="22"/>
+          <w:szCs w:val="22"/>
+        </w:rPr>
+        <w:t xml:space="preserve">Al cambiar de página el foco pasa al contenido principal, de modo que la navegación continúa desde la nueva vista.</w:t>
+      </w:r>
+    </w:p>
+    <w:p>
+      <w:pPr>
+        <w:pStyle w:val="ListParagraph"/>
+        <w:numPr>
+          <w:ilvl w:val="0"/>
+          <w:numId w:val="2"/>
+        </w:numPr>
+        <w:spacing w:after="80" w:line="280"/>
+        <w:jc w:val="both"/>
+      </w:pPr>
+      <w:r>
+        <w:rPr>
+          <w:rFonts w:ascii="Arial" w:cs="Arial" w:eastAsia="Arial" w:hAnsi="Arial"/>
+          <w:sz w:val="22"/>
+          <w:szCs w:val="22"/>
+        </w:rPr>
+        <w:t xml:space="preserve">Menú móvil accesible: se abre con Enter llevando el foco al primer enlace, se cierra con Escape devolviendo el foco al botón, y expone aria-expanded.</w:t>
       </w:r>
     </w:p>
     <w:p>
@@ -4309,7 +4485,109 @@
           <w:sz w:val="22"/>
           <w:szCs w:val="22"/>
         </w:rPr>
-        <w:t xml:space="preserve">Verificacion: 23/23 pruebas automatizadas con Playwright sobre Chrome real recorren el sitio solo con teclado.</w:t>
+        <w:t xml:space="preserve">Verificación: 23/23 pruebas automatizadas con Playwright sobre Chrome real recorren el sitio solo con teclado.</w:t>
+      </w:r>
+    </w:p>
+    <w:p>
+      <w:pPr>
+        <w:pStyle w:val="Heading2"/>
+        <w:spacing w:after="160" w:before="280"/>
+        <w:jc w:val="left"/>
+      </w:pPr>
+      <w:r>
+        <w:rPr>
+          <w:rFonts w:ascii="Arial" w:cs="Arial" w:eastAsia="Arial" w:hAnsi="Arial"/>
+          <w:b/>
+          <w:bCs/>
+          <w:sz w:val="28"/>
+          <w:szCs w:val="28"/>
+        </w:rPr>
+        <w:t xml:space="preserve">6.6. Validación de fechas</w:t>
+      </w:r>
+    </w:p>
+    <w:p>
+      <w:pPr>
+        <w:spacing w:after="160" w:line="300"/>
+        <w:jc w:val="both"/>
+      </w:pPr>
+      <w:r>
+        <w:rPr>
+          <w:rFonts w:ascii="Arial" w:cs="Arial" w:eastAsia="Arial" w:hAnsi="Arial"/>
+          <w:sz w:val="22"/>
+          <w:szCs w:val="22"/>
+        </w:rPr>
+        <w:t xml:space="preserve">El buscador de inicio, el catálogo y el detalle del vehículo validan las fechas antes de llamar al backend. Los campos de fecha tienen min = hoy (fecha local del navegador) y max = inicio + 90 días, y ante un valor inválido se muestra un mensaje en línea bajo el campo, enlazado con aria-describedby, y se deshabilita el botón Buscar o Continuar:</w:t>
+      </w:r>
+    </w:p>
+    <w:p>
+      <w:pPr>
+        <w:pStyle w:val="ListParagraph"/>
+        <w:numPr>
+          <w:ilvl w:val="0"/>
+          <w:numId w:val="2"/>
+        </w:numPr>
+        <w:spacing w:after="80" w:line="280"/>
+        <w:jc w:val="both"/>
+      </w:pPr>
+      <w:r>
+        <w:rPr>
+          <w:rFonts w:ascii="Arial" w:cs="Arial" w:eastAsia="Arial" w:hAnsi="Arial"/>
+          <w:sz w:val="22"/>
+          <w:szCs w:val="22"/>
+        </w:rPr>
+        <w:t xml:space="preserve">"La fecha de inicio no puede ser en el pasado".</w:t>
+      </w:r>
+    </w:p>
+    <w:p>
+      <w:pPr>
+        <w:pStyle w:val="ListParagraph"/>
+        <w:numPr>
+          <w:ilvl w:val="0"/>
+          <w:numId w:val="2"/>
+        </w:numPr>
+        <w:spacing w:after="80" w:line="280"/>
+        <w:jc w:val="both"/>
+      </w:pPr>
+      <w:r>
+        <w:rPr>
+          <w:rFonts w:ascii="Arial" w:cs="Arial" w:eastAsia="Arial" w:hAnsi="Arial"/>
+          <w:sz w:val="22"/>
+          <w:szCs w:val="22"/>
+        </w:rPr>
+        <w:t xml:space="preserve">"La fecha de fin debe ser posterior a la de inicio".</w:t>
+      </w:r>
+    </w:p>
+    <w:p>
+      <w:pPr>
+        <w:pStyle w:val="ListParagraph"/>
+        <w:numPr>
+          <w:ilvl w:val="0"/>
+          <w:numId w:val="2"/>
+        </w:numPr>
+        <w:spacing w:after="80" w:line="280"/>
+        <w:jc w:val="both"/>
+      </w:pPr>
+      <w:r>
+        <w:rPr>
+          <w:rFonts w:ascii="Arial" w:cs="Arial" w:eastAsia="Arial" w:hAnsi="Arial"/>
+          <w:sz w:val="22"/>
+          <w:szCs w:val="22"/>
+        </w:rPr>
+        <w:t xml:space="preserve">"El alquiler no puede superar los 90 días".</w:t>
+      </w:r>
+    </w:p>
+    <w:p>
+      <w:pPr>
+        <w:spacing w:after="160" w:line="300"/>
+        <w:jc w:val="both"/>
+      </w:pPr>
+      <w:r>
+        <w:rPr>
+          <w:rFonts w:ascii="Arial" w:cs="Arial" w:eastAsia="Arial" w:hAnsi="Arial"/>
+          <w:sz w:val="22"/>
+          <w:szCs w:val="22"/>
+        </w:rPr>
+        <w:t xml:space="preserve">El backend repite las mismas reglas (sección 5.2), por lo que una petición que omita la interfaz tampoco puede reservar fechas inválidas.</w:t>
       </w:r>
     </w:p>
     <w:p>
@@ -4357,7 +4635,7 @@
           <w:sz w:val="22"/>
           <w:szCs w:val="22"/>
         </w:rPr>
-        <w:t xml:space="preserve">El backend se despliega como Web Service en Render conectado directamente al repositorio de GitHub. Render ejecuta npm ci, compila con npm run build y arranca el servicio con node dist/main.js. Las variables de entorno se configuran desde el panel: DATABASE_URL apunta al servicio interno de PostgreSQL, JWT_SECRET se genera aleatoriamente y FRONTEND_URL apunta al dominio publico de Vercel para el filtro CORS.</w:t>
+        <w:t xml:space="preserve">El backend se despliega como Web Service en Render conectado directamente al repositorio de GitHub. Render ejecuta npm ci, compila con npm run build y arranca el servicio con node dist/main.js. Las variables de entorno se configuran desde el panel: DATABASE_URL apunta al servicio interno de PostgreSQL, JWT_SECRET se genera aleatoriamente y FRONTEND_URL apunta al dominio público de Vercel para el filtro CORS.</w:t>
       </w:r>
     </w:p>
     <w:p>
@@ -4388,7 +4666,7 @@
           <w:sz w:val="22"/>
           <w:szCs w:val="22"/>
         </w:rPr>
-        <w:t xml:space="preserve">La base de datos PostgreSQL 16 se aprovisiona con el plan gratuito de Render. TypeORM sincroniza el esquema en cada despliegue mediante la opcion synchronize (aceptable en el Reto 1). En Reto 2 se sustituira por migraciones controladas. El script npm run seed carga los datos iniciales de prueba (3 proveedores, 4 agencias, 10 vehiculos con imagenes) desde el shell del servicio.</w:t>
+        <w:t xml:space="preserve">La base de datos PostgreSQL 16 se aprovisiona con el plan gratuito de Render. TypeORM sincroniza el esquema en cada despliegue mediante la opción synchronize (aceptable en el Reto 1). En Reto 2 se sustituirá por migraciones controladas. El script npm run seed carga los datos iniciales de prueba (3 proveedores, 4 agencias, 10 vehículos con imágenes) desde el shell del servicio.</w:t>
       </w:r>
     </w:p>
     <w:p>
@@ -4419,7 +4697,7 @@
           <w:sz w:val="22"/>
           <w:szCs w:val="22"/>
         </w:rPr>
-        <w:t xml:space="preserve">El frontend se despliega como Static Site en Vercel con framework preset Vite. Vercel detecta la carpeta frontend, ejecuta npm run build y publica el contenido de dist. Las variables VITE_API_URL y VITE_AFFILIATE_ID controlan el endpoint del backend y el afiliado que el cliente HTTP envia en todas sus peticiones publicas.</w:t>
+        <w:t xml:space="preserve">El frontend se despliega como Static Site en Vercel con framework preset Vite. Vercel detecta la carpeta frontend, ejecuta npm run build y publica el contenido de dist. Las variables VITE_API_URL y VITE_AFFILIATE_ID controlan el endpoint del backend y el afiliado que el cliente HTTP envia en todas sus peticiones públicas.</w:t>
       </w:r>
     </w:p>
     <w:p>
@@ -4436,7 +4714,7 @@
           <w:sz w:val="32"/>
           <w:szCs w:val="32"/>
         </w:rPr>
-        <w:t xml:space="preserve">8. Preparacion para la Integracion Booking Prototipo</w:t>
+        <w:t xml:space="preserve">8. Preparación para la Integración Booking Prototipo</w:t>
       </w:r>
     </w:p>
     <w:p>
@@ -4450,7 +4728,7 @@
           <w:sz w:val="22"/>
           <w:szCs w:val="22"/>
         </w:rPr>
-        <w:t xml:space="preserve">El objetivo del Reto 2 es que la plataforma central Booking Prototipo consuma los datos publicados por cada sistema individual siguiendo los contratos. RentaFacil EC ya expone los contratos exactamente como el central los espera consumir: mismos endpoints, mismos esquemas, mismos codigos de error. La integracion se limitara a apuntar el gateway del central hacia esta implementacion.</w:t>
+        <w:t xml:space="preserve">El objetivo del Reto 2 es que la plataforma central Booking Prototipo consuma los datos publicados por cada sistema individual siguiendo los contratos. RentaFacil EC ya expone los contratos exactamente como el central los espera consumir: mismos endpoints, mismos esquemas, mismos códigos de error. La integración se limitará a apuntar el gateway del central hacia esta implementación.</w:t>
       </w:r>
     </w:p>
     <w:p>
@@ -4505,45 +4783,45 @@
           <w:sz w:val="22"/>
           <w:szCs w:val="22"/>
         </w:rPr>
-        <w:t xml:space="preserve">POST /details, /depots, /suppliers, /constants: usados para armar la vista de detalle y catalogos del central.</w:t>
-      </w:r>
-    </w:p>
-    <w:p>
-      <w:pPr>
-        <w:pStyle w:val="ListParagraph"/>
-        <w:numPr>
-          <w:ilvl w:val="0"/>
-          <w:numId w:val="2"/>
-        </w:numPr>
-        <w:spacing w:after="80" w:line="280"/>
-        <w:jc w:val="both"/>
-      </w:pPr>
-      <w:r>
-        <w:rPr>
-          <w:rFonts w:ascii="Arial" w:cs="Arial" w:eastAsia="Arial" w:hAnsi="Arial"/>
-          <w:sz w:val="22"/>
-          <w:szCs w:val="22"/>
-        </w:rPr>
-        <w:t xml:space="preserve">POST /orders/hold, /orders/preview y /orders/create: usados cuando el central actua como agente de reserva en nombre del cliente final.</w:t>
-      </w:r>
-    </w:p>
-    <w:p>
-      <w:pPr>
-        <w:pStyle w:val="ListParagraph"/>
-        <w:numPr>
-          <w:ilvl w:val="0"/>
-          <w:numId w:val="2"/>
-        </w:numPr>
-        <w:spacing w:after="80" w:line="280"/>
-        <w:jc w:val="both"/>
-      </w:pPr>
-      <w:r>
-        <w:rPr>
-          <w:rFonts w:ascii="Arial" w:cs="Arial" w:eastAsia="Arial" w:hAnsi="Arial"/>
-          <w:sz w:val="22"/>
-          <w:szCs w:val="22"/>
-        </w:rPr>
-        <w:t xml:space="preserve">GET /orders/{orderId} y POST /orders/{orderId}/cancel: usados en la etapa de postventa y atencion al cliente.</w:t>
+        <w:t xml:space="preserve">POST /details, /depots, /suppliers, /constants: usados para armar la vista de detalle y catálogos del central.</w:t>
+      </w:r>
+    </w:p>
+    <w:p>
+      <w:pPr>
+        <w:pStyle w:val="ListParagraph"/>
+        <w:numPr>
+          <w:ilvl w:val="0"/>
+          <w:numId w:val="2"/>
+        </w:numPr>
+        <w:spacing w:after="80" w:line="280"/>
+        <w:jc w:val="both"/>
+      </w:pPr>
+      <w:r>
+        <w:rPr>
+          <w:rFonts w:ascii="Arial" w:cs="Arial" w:eastAsia="Arial" w:hAnsi="Arial"/>
+          <w:sz w:val="22"/>
+          <w:szCs w:val="22"/>
+        </w:rPr>
+        <w:t xml:space="preserve">POST /orders/hold, /orders/preview y /orders/create: usados cuando el central actúa como agente de reserva en nombre del cliente final.</w:t>
+      </w:r>
+    </w:p>
+    <w:p>
+      <w:pPr>
+        <w:pStyle w:val="ListParagraph"/>
+        <w:numPr>
+          <w:ilvl w:val="0"/>
+          <w:numId w:val="2"/>
+        </w:numPr>
+        <w:spacing w:after="80" w:line="280"/>
+        <w:jc w:val="both"/>
+      </w:pPr>
+      <w:r>
+        <w:rPr>
+          <w:rFonts w:ascii="Arial" w:cs="Arial" w:eastAsia="Arial" w:hAnsi="Arial"/>
+          <w:sz w:val="22"/>
+          <w:szCs w:val="22"/>
+        </w:rPr>
+        <w:t xml:space="preserve">GET /orders/{orderId} y POST /orders/{orderId}/cancel: usados en la etapa de postventa y atención al cliente.</w:t>
       </w:r>
     </w:p>
     <w:p>
@@ -4579,7 +4857,7 @@
           <w:sz w:val="32"/>
           <w:szCs w:val="32"/>
         </w:rPr>
-        <w:t xml:space="preserve">9. Propuesta de Evolucion hacia Microservicios</w:t>
+        <w:t xml:space="preserve">9. Propuesta de Evolución hacia Microservicios</w:t>
       </w:r>
     </w:p>
     <w:p>
@@ -4593,7 +4871,7 @@
           <w:sz w:val="22"/>
           <w:szCs w:val="22"/>
         </w:rPr>
-        <w:t xml:space="preserve">El diseno modular actual permite promover cada agregado del dominio a un microservicio independiente. La descomposicion propuesta para el Reto 2 es la siguiente:</w:t>
+        <w:t xml:space="preserve">El diseño modular actual permite promover cada agregado del dominio a un microservicio independiente. La descomposición propuesta para el Reto 2 es la siguiente:</w:t>
       </w:r>
     </w:p>
     <w:tbl>
@@ -5021,64 +5299,64 @@
           <w:sz w:val="28"/>
           <w:szCs w:val="28"/>
         </w:rPr>
-        <w:t xml:space="preserve">9.1. Comunicacion entre servicios</w:t>
-      </w:r>
-    </w:p>
-    <w:p>
-      <w:pPr>
-        <w:pStyle w:val="ListParagraph"/>
-        <w:numPr>
-          <w:ilvl w:val="0"/>
-          <w:numId w:val="2"/>
-        </w:numPr>
-        <w:spacing w:after="80" w:line="280"/>
-        <w:jc w:val="both"/>
-      </w:pPr>
-      <w:r>
-        <w:rPr>
-          <w:rFonts w:ascii="Arial" w:cs="Arial" w:eastAsia="Arial" w:hAnsi="Arial"/>
-          <w:sz w:val="22"/>
-          <w:szCs w:val="22"/>
-        </w:rPr>
-        <w:t xml:space="preserve">Sincrona: REST y gRPC entre booking-service y catalog-service para verificar disponibilidad en tiempo real.</w:t>
-      </w:r>
-    </w:p>
-    <w:p>
-      <w:pPr>
-        <w:pStyle w:val="ListParagraph"/>
-        <w:numPr>
-          <w:ilvl w:val="0"/>
-          <w:numId w:val="2"/>
-        </w:numPr>
-        <w:spacing w:after="80" w:line="280"/>
-        <w:jc w:val="both"/>
-      </w:pPr>
-      <w:r>
-        <w:rPr>
-          <w:rFonts w:ascii="Arial" w:cs="Arial" w:eastAsia="Arial" w:hAnsi="Arial"/>
-          <w:sz w:val="22"/>
-          <w:szCs w:val="22"/>
-        </w:rPr>
-        <w:t xml:space="preserve">Asincrona: broker de eventos (Kafka) para CAR_ORDER_CONFIRMED, CAR_ORDER_CANCELLED, DEPOT_UPDATE y HOLD_EXPIRED.</w:t>
-      </w:r>
-    </w:p>
-    <w:p>
-      <w:pPr>
-        <w:pStyle w:val="ListParagraph"/>
-        <w:numPr>
-          <w:ilvl w:val="0"/>
-          <w:numId w:val="2"/>
-        </w:numPr>
-        <w:spacing w:after="80" w:line="280"/>
-        <w:jc w:val="both"/>
-      </w:pPr>
-      <w:r>
-        <w:rPr>
-          <w:rFonts w:ascii="Arial" w:cs="Arial" w:eastAsia="Arial" w:hAnsi="Arial"/>
-          <w:sz w:val="22"/>
-          <w:szCs w:val="22"/>
-        </w:rPr>
-        <w:t xml:space="preserve">Un API Gateway se ubicara delante de todos los servicios para exponer el contrato oficial autos-openapi.yaml en una sola URL publica, aplicar rate limiting (contrato indica 429) y centralizar OAuth2.</w:t>
+        <w:t xml:space="preserve">9.1. Comunicación entre servicios</w:t>
+      </w:r>
+    </w:p>
+    <w:p>
+      <w:pPr>
+        <w:pStyle w:val="ListParagraph"/>
+        <w:numPr>
+          <w:ilvl w:val="0"/>
+          <w:numId w:val="2"/>
+        </w:numPr>
+        <w:spacing w:after="80" w:line="280"/>
+        <w:jc w:val="both"/>
+      </w:pPr>
+      <w:r>
+        <w:rPr>
+          <w:rFonts w:ascii="Arial" w:cs="Arial" w:eastAsia="Arial" w:hAnsi="Arial"/>
+          <w:sz w:val="22"/>
+          <w:szCs w:val="22"/>
+        </w:rPr>
+        <w:t xml:space="preserve">Síncrona: REST y gRPC entre booking-service y catalog-service para verificar disponibilidad en tiempo real.</w:t>
+      </w:r>
+    </w:p>
+    <w:p>
+      <w:pPr>
+        <w:pStyle w:val="ListParagraph"/>
+        <w:numPr>
+          <w:ilvl w:val="0"/>
+          <w:numId w:val="2"/>
+        </w:numPr>
+        <w:spacing w:after="80" w:line="280"/>
+        <w:jc w:val="both"/>
+      </w:pPr>
+      <w:r>
+        <w:rPr>
+          <w:rFonts w:ascii="Arial" w:cs="Arial" w:eastAsia="Arial" w:hAnsi="Arial"/>
+          <w:sz w:val="22"/>
+          <w:szCs w:val="22"/>
+        </w:rPr>
+        <w:t xml:space="preserve">Asíncrona: broker de eventos (Kafka) para CAR_ORDER_CONFIRMED, CAR_ORDER_CANCELLED, DEPOT_UPDATE y HOLD_EXPIRED.</w:t>
+      </w:r>
+    </w:p>
+    <w:p>
+      <w:pPr>
+        <w:pStyle w:val="ListParagraph"/>
+        <w:numPr>
+          <w:ilvl w:val="0"/>
+          <w:numId w:val="2"/>
+        </w:numPr>
+        <w:spacing w:after="80" w:line="280"/>
+        <w:jc w:val="both"/>
+      </w:pPr>
+      <w:r>
+        <w:rPr>
+          <w:rFonts w:ascii="Arial" w:cs="Arial" w:eastAsia="Arial" w:hAnsi="Arial"/>
+          <w:sz w:val="22"/>
+          <w:szCs w:val="22"/>
+        </w:rPr>
+        <w:t xml:space="preserve">Un API Gateway se ubicará delante de todos los servicios para exponer el contrato oficial autos-openapi.yaml en una sola URL pública, aplicar rate limiting (contrato indica 429) y centralizar OAuth2.</w:t>
       </w:r>
     </w:p>
     <w:p>
@@ -5114,26 +5392,26 @@
           <w:sz w:val="22"/>
           <w:szCs w:val="22"/>
         </w:rPr>
-        <w:t xml:space="preserve">Observabilidad: logs estructurados, trazas distribuidas con OpenTelemetry y metricas con Prometheus.</w:t>
-      </w:r>
-    </w:p>
-    <w:p>
-      <w:pPr>
-        <w:pStyle w:val="ListParagraph"/>
-        <w:numPr>
-          <w:ilvl w:val="0"/>
-          <w:numId w:val="2"/>
-        </w:numPr>
-        <w:spacing w:after="80" w:line="280"/>
-        <w:jc w:val="both"/>
-      </w:pPr>
-      <w:r>
-        <w:rPr>
-          <w:rFonts w:ascii="Arial" w:cs="Arial" w:eastAsia="Arial" w:hAnsi="Arial"/>
-          <w:sz w:val="22"/>
-          <w:szCs w:val="22"/>
-        </w:rPr>
-        <w:t xml:space="preserve">Seguridad: OAuth2 con OIDC segun securitySchemes.OAuth2Security del contrato, secretos en Vault y TLS obligatorio.</w:t>
+        <w:t xml:space="preserve">Observabilidad: logs estructurados, trazas distribuidas con OpenTelemetry y métricas con Prometheus.</w:t>
+      </w:r>
+    </w:p>
+    <w:p>
+      <w:pPr>
+        <w:pStyle w:val="ListParagraph"/>
+        <w:numPr>
+          <w:ilvl w:val="0"/>
+          <w:numId w:val="2"/>
+        </w:numPr>
+        <w:spacing w:after="80" w:line="280"/>
+        <w:jc w:val="both"/>
+      </w:pPr>
+      <w:r>
+        <w:rPr>
+          <w:rFonts w:ascii="Arial" w:cs="Arial" w:eastAsia="Arial" w:hAnsi="Arial"/>
+          <w:sz w:val="22"/>
+          <w:szCs w:val="22"/>
+        </w:rPr>
+        <w:t xml:space="preserve">Seguridad: OAuth2 con OIDC según securitySchemes.OAuth2Security del contrato, secretos en Vault y TLS obligatorio.</w:t>
       </w:r>
     </w:p>
     <w:p>
@@ -5183,7 +5461,7 @@
           <w:sz w:val="22"/>
           <w:szCs w:val="22"/>
         </w:rPr>
-        <w:t xml:space="preserve">La ejecucion del Reto 1 demuestra que un enfoque API-first estricto, con contratos externos como fuente de verdad, permite construir sistemas que se integran naturalmente en una plataforma central sin trabajo de acoplamiento adicional. La estructura modular del backend NestJS, sumada al patron BFF y a los guards transversales, deja el terreno preparado para promover cada agregado a un microservicio independiente en el Reto 2 sin reescribir logica de negocio.</w:t>
+        <w:t xml:space="preserve">La ejecución del Reto 1 demuestra que un enfoque API-first estricto, con contratos externos como fuente de verdad, permite construir sistemas que se integran naturalmente en una plataforma central sin trabajo de acoplamiento adicional. La estructura modular del backend NestJS, sumada al patrón BFF y a los guards transversales, deja el terreno preparado para promover cada agregado a un microservicio independiente en el Reto 2 sin reescribir lógica de negocio.</w:t>
       </w:r>
     </w:p>
     <w:p>
@@ -5197,7 +5475,7 @@
           <w:sz w:val="22"/>
           <w:szCs w:val="22"/>
         </w:rPr>
-        <w:t xml:space="preserve">RentaFacil EC queda desplegado publicamente con base de datos operativa, panel administrativo funcional y marketplace responsivo, cumpliendo integramente todos los entregables del Reto 1 y alineandose con el contrato GDS Autos Core API v1.0.0 provisto por la docente.</w:t>
+        <w:t xml:space="preserve">RentaFacil EC queda desplegado públicamente con base de datos operativa, panel administrativo funcional y marketplace responsivo, cumpliendo íntegramente todos los entregables del Reto 1 y alineándose con el contrato GDS Autos Core API v1.0.0 provisto por la docente.</w:t>
       </w:r>
     </w:p>
     <w:sectPr>

</xml_diff>

<commit_message>
feat(validación): todos los formularios validados en frontend y backend; feat(reservas): autollenado del conductor desde el perfil; ui: login y simulador de pago más limpios
- Nombres solo letras, correo con una sola @, teléfono solo números (9-15 dígitos), cédula con dígito verificador
- Vehículos/agencias/proveedores: rangos, placa ABC-1234 única y referencias existentes (400 en vez de 500)
- GET /account/profile para autollenar los datos del conductor (editables)
- Seed: María Maldonado (0983563584) y teléfonos demo en formato local
- Se quita el texto técnico del login y el recuadro amarillo del simulador de pago

Co-Authored-By: Claude Opus 5.5 <noreply@anthropic.com>
</commit_message>
<xml_diff>
--- a/docs/documento-tecnico.docx
+++ b/docs/documento-tecnico.docx
@@ -4062,7 +4062,7 @@
           <w:sz w:val="22"/>
           <w:szCs w:val="22"/>
         </w:rPr>
-        <w:t xml:space="preserve">Usuarios: alta, edición y eliminación de clientes y administradores en una ventana modal accesible, con validación de correo y cédula, contraseña de mínimo 8 caracteres, botón "Generar contraseña aleatoria" y, al crear, las credenciales en pantalla con el botón "Copiar credenciales".</w:t>
+        <w:t xml:space="preserve">Usuarios: alta, edición y eliminación de clientes y administradores en una ventana modal accesible, con validación de nombre y apellido (solo letras), correo (una sola @), teléfono (solo números) y cédula ecuatoriana (dígito verificador), contraseña de mínimo 8 caracteres, botón "Generar contraseña aleatoria" y, al crear, las credenciales en pantalla con el botón "Copiar credenciales".</w:t>
       </w:r>
     </w:p>
     <w:p>
@@ -4254,7 +4254,7 @@
           <w:sz w:val="22"/>
           <w:szCs w:val="22"/>
         </w:rPr>
-        <w:t xml:space="preserve">Muestra el total a cobrar tomado de preview.data.total_price y un aviso visible de modo simulador: ningún cargo real se procesa y los datos de la tarjeta nunca se envian al backend.</w:t>
+        <w:t xml:space="preserve">Muestra el total a cobrar tomado de preview.data.total_price. Ningún cargo real se procesa y los datos de la tarjeta nunca se envían al backend.</w:t>
       </w:r>
     </w:p>
     <w:p>
@@ -4588,6 +4588,151 @@
           <w:szCs w:val="22"/>
         </w:rPr>
         <w:t xml:space="preserve">El backend repite las mismas reglas (sección 5.2), por lo que una petición que omita la interfaz tampoco puede reservar fechas inválidas.</w:t>
+      </w:r>
+    </w:p>
+    <w:p>
+      <w:pPr>
+        <w:pStyle w:val="Heading2"/>
+        <w:spacing w:after="160" w:before="280"/>
+        <w:jc w:val="left"/>
+      </w:pPr>
+      <w:r>
+        <w:rPr>
+          <w:rFonts w:ascii="Arial" w:cs="Arial" w:eastAsia="Arial" w:hAnsi="Arial"/>
+          <w:b/>
+          <w:bCs/>
+          <w:sz w:val="28"/>
+          <w:szCs w:val="28"/>
+        </w:rPr>
+        <w:t xml:space="preserve">6.7. Validación de datos y autollenado</w:t>
+      </w:r>
+    </w:p>
+    <w:p>
+      <w:pPr>
+        <w:spacing w:after="160" w:line="300"/>
+        <w:jc w:val="both"/>
+      </w:pPr>
+      <w:r>
+        <w:rPr>
+          <w:rFonts w:ascii="Arial" w:cs="Arial" w:eastAsia="Arial" w:hAnsi="Arial"/>
+          <w:sz w:val="22"/>
+          <w:szCs w:val="22"/>
+        </w:rPr>
+        <w:t xml:space="preserve">Todos los formularios aplican las mismas reglas en el frontend (mensajes en línea antes de enviar) y en el backend (respuesta 400 con code VALIDATION_FAILED), de modo que una petición directa a la API no puede guardar lo que la interfaz rechaza:</w:t>
+      </w:r>
+    </w:p>
+    <w:p>
+      <w:pPr>
+        <w:pStyle w:val="ListParagraph"/>
+        <w:numPr>
+          <w:ilvl w:val="0"/>
+          <w:numId w:val="2"/>
+        </w:numPr>
+        <w:spacing w:after="80" w:line="280"/>
+        <w:jc w:val="both"/>
+      </w:pPr>
+      <w:r>
+        <w:rPr>
+          <w:rFonts w:ascii="Arial" w:cs="Arial" w:eastAsia="Arial" w:hAnsi="Arial"/>
+          <w:sz w:val="22"/>
+          <w:szCs w:val="22"/>
+        </w:rPr>
+        <w:t xml:space="preserve">Nombres y apellidos: solo letras (con tildes y ñ), espacios, apóstrofo o guion; entre 2 y 60 caracteres. No se pueden teclear números.</w:t>
+      </w:r>
+    </w:p>
+    <w:p>
+      <w:pPr>
+        <w:pStyle w:val="ListParagraph"/>
+        <w:numPr>
+          <w:ilvl w:val="0"/>
+          <w:numId w:val="2"/>
+        </w:numPr>
+        <w:spacing w:after="80" w:line="280"/>
+        <w:jc w:val="both"/>
+      </w:pPr>
+      <w:r>
+        <w:rPr>
+          <w:rFonts w:ascii="Arial" w:cs="Arial" w:eastAsia="Arial" w:hAnsi="Arial"/>
+          <w:sz w:val="22"/>
+          <w:szCs w:val="22"/>
+        </w:rPr>
+        <w:t xml:space="preserve">Correo electrónico: exactamente una @ y un dominio con punto (ej. nombre@dominio.com); la segunda @ ni siquiera se puede escribir.</w:t>
+      </w:r>
+    </w:p>
+    <w:p>
+      <w:pPr>
+        <w:pStyle w:val="ListParagraph"/>
+        <w:numPr>
+          <w:ilvl w:val="0"/>
+          <w:numId w:val="2"/>
+        </w:numPr>
+        <w:spacing w:after="80" w:line="280"/>
+        <w:jc w:val="both"/>
+      </w:pPr>
+      <w:r>
+        <w:rPr>
+          <w:rFonts w:ascii="Arial" w:cs="Arial" w:eastAsia="Arial" w:hAnsi="Arial"/>
+          <w:sz w:val="22"/>
+          <w:szCs w:val="22"/>
+        </w:rPr>
+        <w:t xml:space="preserve">Teléfono: solo números, con "+" opcional al inicio, entre 9 y 15 dígitos (ej. 0983563584); las letras se descartan al teclear.</w:t>
+      </w:r>
+    </w:p>
+    <w:p>
+      <w:pPr>
+        <w:pStyle w:val="ListParagraph"/>
+        <w:numPr>
+          <w:ilvl w:val="0"/>
+          <w:numId w:val="2"/>
+        </w:numPr>
+        <w:spacing w:after="80" w:line="280"/>
+        <w:jc w:val="both"/>
+      </w:pPr>
+      <w:r>
+        <w:rPr>
+          <w:rFonts w:ascii="Arial" w:cs="Arial" w:eastAsia="Arial" w:hAnsi="Arial"/>
+          <w:sz w:val="22"/>
+          <w:szCs w:val="22"/>
+        </w:rPr>
+        <w:t xml:space="preserve">Cédula: 10 dígitos con provincia válida y dígito verificador (módulo 10), única por usuario.</w:t>
+      </w:r>
+    </w:p>
+    <w:p>
+      <w:pPr>
+        <w:pStyle w:val="ListParagraph"/>
+        <w:numPr>
+          <w:ilvl w:val="0"/>
+          <w:numId w:val="2"/>
+        </w:numPr>
+        <w:spacing w:after="80" w:line="280"/>
+        <w:jc w:val="both"/>
+      </w:pPr>
+      <w:r>
+        <w:rPr>
+          <w:rFonts w:ascii="Arial" w:cs="Arial" w:eastAsia="Arial" w:hAnsi="Arial"/>
+          <w:sz w:val="22"/>
+          <w:szCs w:val="22"/>
+        </w:rPr>
+        <w:t xml:space="preserve">Vehículos, agencias y proveedores: año entre 1990 y el próximo año, placa con formato ABC-1234 y única, precio mayor que cero, pasajeros, puertas y maletas en rangos válidos, código IATA de 3 letras y puntuación entre 0 y 5. Una agencia o proveedor inexistente devuelve 400 con un mensaje claro en lugar de un error de base de datos.</w:t>
+      </w:r>
+    </w:p>
+    <w:p>
+      <w:pPr>
+        <w:pStyle w:val="ListParagraph"/>
+        <w:numPr>
+          <w:ilvl w:val="0"/>
+          <w:numId w:val="2"/>
+        </w:numPr>
+        <w:spacing w:after="80" w:line="280"/>
+        <w:jc w:val="both"/>
+      </w:pPr>
+      <w:r>
+        <w:rPr>
+          <w:rFonts w:ascii="Arial" w:cs="Arial" w:eastAsia="Arial" w:hAnsi="Arial"/>
+          <w:sz w:val="22"/>
+          <w:szCs w:val="22"/>
+        </w:rPr>
+        <w:t xml:space="preserve">Autollenado: al reservar, los datos del conductor (nombre, apellido, correo y teléfono) se completan desde el perfil del usuario (GET /account/profile) y siguen siendo editables, por si se reserva para otra persona.</w:t>
       </w:r>
     </w:p>
     <w:p>

</xml_diff>